<commit_message>
Start of documentation tour
</commit_message>
<xml_diff>
--- a/doc/Projekt DocxDocument.docx
+++ b/doc/Projekt DocxDocument.docx
@@ -1,6 +1,6 @@
 
 <file path=word/document.xml><?xml version="1.0" encoding="utf-8"?>
-<w:document xmlns:wpc="http://schemas.microsoft.com/office/word/2010/wordprocessingCanvas" xmlns:cx="http://schemas.microsoft.com/office/drawing/2014/chartex" xmlns:cx1="http://schemas.microsoft.com/office/drawing/2015/9/8/chartex" xmlns:cx2="http://schemas.microsoft.com/office/drawing/2015/10/21/chartex" xmlns:cx3="http://schemas.microsoft.com/office/drawing/2016/5/9/chartex" xmlns:cx4="http://schemas.microsoft.com/office/drawing/2016/5/10/chartex" xmlns:cx5="http://schemas.microsoft.com/office/drawing/2016/5/11/chartex" xmlns:cx6="http://schemas.microsoft.com/office/drawing/2016/5/12/chartex" xmlns:cx7="http://schemas.microsoft.com/office/drawing/2016/5/13/chartex" xmlns:cx8="http://schemas.microsoft.com/office/drawing/2016/5/14/chartex" xmlns:mc="http://schemas.openxmlformats.org/markup-compatibility/2006" xmlns:aink="http://schemas.microsoft.com/office/drawing/2016/ink" xmlns:am3d="http://schemas.microsoft.com/office/drawing/2017/model3d" xmlns:o="urn:schemas-microsoft-com:office:office" xmlns:oel="http://schemas.microsoft.com/office/2019/extlst" xmlns:r="http://schemas.openxmlformats.org/officeDocument/2006/relationships" xmlns:m="http://schemas.openxmlformats.org/officeDocument/2006/math" xmlns:v="urn:schemas-microsoft-com:vml" xmlns:wp14="http://schemas.microsoft.com/office/word/2010/wordprocessingDrawing" xmlns:wp="http://schemas.openxmlformats.org/drawingml/2006/wordprocessingDrawing" xmlns:w10="urn:schemas-microsoft-com:office:word" xmlns:w="http://schemas.openxmlformats.org/wordprocessingml/2006/main" xmlns:w14="http://schemas.microsoft.com/office/word/2010/wordml" xmlns:w15="http://schemas.microsoft.com/office/word/2012/wordml" xmlns:w16cex="http://schemas.microsoft.com/office/word/2018/wordml/cex" xmlns:w16cid="http://schemas.microsoft.com/office/word/2016/wordml/cid" xmlns:w16="http://schemas.microsoft.com/office/word/2018/wordml" xmlns:w16sdtdh="http://schemas.microsoft.com/office/word/2020/wordml/sdtdatahash" xmlns:w16se="http://schemas.microsoft.com/office/word/2015/wordml/symex" xmlns:wpg="http://schemas.microsoft.com/office/word/2010/wordprocessingGroup" xmlns:wpi="http://schemas.microsoft.com/office/word/2010/wordprocessingInk" xmlns:wne="http://schemas.microsoft.com/office/word/2006/wordml" xmlns:wps="http://schemas.microsoft.com/office/word/2010/wordprocessingShape" mc:Ignorable="w14 w15 w16se w16cid w16 w16cex w16sdtdh wp14">
+<w:document xmlns:wpc="http://schemas.microsoft.com/office/word/2010/wordprocessingCanvas" xmlns:cx="http://schemas.microsoft.com/office/drawing/2014/chartex" xmlns:cx1="http://schemas.microsoft.com/office/drawing/2015/9/8/chartex" xmlns:cx2="http://schemas.microsoft.com/office/drawing/2015/10/21/chartex" xmlns:cx3="http://schemas.microsoft.com/office/drawing/2016/5/9/chartex" xmlns:cx4="http://schemas.microsoft.com/office/drawing/2016/5/10/chartex" xmlns:cx5="http://schemas.microsoft.com/office/drawing/2016/5/11/chartex" xmlns:cx6="http://schemas.microsoft.com/office/drawing/2016/5/12/chartex" xmlns:cx7="http://schemas.microsoft.com/office/drawing/2016/5/13/chartex" xmlns:cx8="http://schemas.microsoft.com/office/drawing/2016/5/14/chartex" xmlns:mc="http://schemas.openxmlformats.org/markup-compatibility/2006" xmlns:aink="http://schemas.microsoft.com/office/drawing/2016/ink" xmlns:am3d="http://schemas.microsoft.com/office/drawing/2017/model3d" xmlns:o="urn:schemas-microsoft-com:office:office" xmlns:oel="http://schemas.microsoft.com/office/2019/extlst" xmlns:r="http://schemas.openxmlformats.org/officeDocument/2006/relationships" xmlns:m="http://schemas.openxmlformats.org/officeDocument/2006/math" xmlns:v="urn:schemas-microsoft-com:vml" xmlns:wp14="http://schemas.microsoft.com/office/word/2010/wordprocessingDrawing" xmlns:wp="http://schemas.openxmlformats.org/drawingml/2006/wordprocessingDrawing" xmlns:w10="urn:schemas-microsoft-com:office:word" xmlns:w="http://schemas.openxmlformats.org/wordprocessingml/2006/main" xmlns:w14="http://schemas.microsoft.com/office/word/2010/wordml" xmlns:w15="http://schemas.microsoft.com/office/word/2012/wordml" xmlns:w16cex="http://schemas.microsoft.com/office/word/2018/wordml/cex" xmlns:w16cid="http://schemas.microsoft.com/office/word/2016/wordml/cid" xmlns:w16="http://schemas.microsoft.com/office/word/2018/wordml" xmlns:w16du="http://schemas.microsoft.com/office/word/2023/wordml/word16du" xmlns:w16sdtdh="http://schemas.microsoft.com/office/word/2020/wordml/sdtdatahash" xmlns:w16sdtfl="http://schemas.microsoft.com/office/word/2024/wordml/sdtformatlock" xmlns:w16se="http://schemas.microsoft.com/office/word/2015/wordml/symex" xmlns:wpg="http://schemas.microsoft.com/office/word/2010/wordprocessingGroup" xmlns:wpi="http://schemas.microsoft.com/office/word/2010/wordprocessingInk" xmlns:wne="http://schemas.microsoft.com/office/word/2006/wordml" xmlns:wps="http://schemas.microsoft.com/office/word/2010/wordprocessingShape" mc:Ignorable="w14 w15 w16se w16cid w16 w16cex w16sdtdh w16sdtfl w16du wp14">
   <w:body>
     <w:p>
       <w:pPr>
@@ -13,7 +13,7 @@
     </w:p>
     <w:p>
       <w:pPr>
-        <w:pStyle w:val="Tytu"/>
+        <w:pStyle w:val="Title"/>
         <w:outlineLvl w:val="9"/>
       </w:pPr>
       <w:r>
@@ -70,7 +70,7 @@
     <w:p/>
     <w:p>
       <w:pPr>
-        <w:pStyle w:val="Nagwek1"/>
+        <w:pStyle w:val="Heading1"/>
       </w:pPr>
       <w:r>
         <w:t>Wprowadzenie</w:t>
@@ -78,7 +78,7 @@
     </w:p>
     <w:p>
       <w:pPr>
-        <w:pStyle w:val="Wcicienormalne"/>
+        <w:pStyle w:val="NormalIndent"/>
       </w:pPr>
       <w:r>
         <w:t xml:space="preserve">Celem projektu jest </w:t>
@@ -107,7 +107,7 @@
     </w:p>
     <w:p>
       <w:pPr>
-        <w:pStyle w:val="Wcicienormalne"/>
+        <w:pStyle w:val="NormalIndent"/>
       </w:pPr>
       <w:r>
         <w:t>Aktualnie deweloperzy mają kilka możliwości pisania własnych aplikacji do przetwarzania dokumentów programu Word.</w:t>
@@ -115,7 +115,7 @@
     </w:p>
     <w:p>
       <w:pPr>
-        <w:pStyle w:val="Wcicienormalne"/>
+        <w:pStyle w:val="NormalIndent"/>
         <w:numPr>
           <w:ilvl w:val="0"/>
           <w:numId w:val="44"/>
@@ -202,7 +202,7 @@
     </w:p>
     <w:p>
       <w:pPr>
-        <w:pStyle w:val="Wcicienormalne"/>
+        <w:pStyle w:val="NormalIndent"/>
         <w:numPr>
           <w:ilvl w:val="0"/>
           <w:numId w:val="44"/>
@@ -359,7 +359,7 @@
     </w:p>
     <w:p>
       <w:pPr>
-        <w:pStyle w:val="Wcicienormalne"/>
+        <w:pStyle w:val="NormalIndent"/>
         <w:numPr>
           <w:ilvl w:val="0"/>
           <w:numId w:val="44"/>
@@ -398,7 +398,7 @@
     </w:p>
     <w:p>
       <w:pPr>
-        <w:pStyle w:val="Wcicienormalne"/>
+        <w:pStyle w:val="NormalIndent"/>
         <w:numPr>
           <w:ilvl w:val="0"/>
           <w:numId w:val="44"/>
@@ -489,7 +489,13 @@
         <w:t xml:space="preserve">normalnie przez aplikację Word (np. wyszukiwanie i zamianę tekstu). Te operacje deweloper musi zaimplementować samodzielnie. Niektóre operacje </w:t>
       </w:r>
       <w:r>
-        <w:t xml:space="preserve">zostały napisane i udostępnione na GitHubie </w:t>
+        <w:t xml:space="preserve">zostały napisane i udostępnione </w:t>
+      </w:r>
+      <w:r>
+        <w:t>w serwisie</w:t>
+      </w:r>
+      <w:r>
+        <w:t xml:space="preserve"> GitHub </w:t>
       </w:r>
       <w:r>
         <w:t xml:space="preserve">przez </w:t>
@@ -521,7 +527,7 @@
     </w:p>
     <w:p>
       <w:pPr>
-        <w:pStyle w:val="Wcicienormalne"/>
+        <w:pStyle w:val="NormalIndent"/>
       </w:pPr>
       <w:r>
         <w:t xml:space="preserve">Przedstawione powyżej rozwiązania mają swoje wady i zalety. </w:t>
@@ -602,7 +608,7 @@
     </w:p>
     <w:p>
       <w:pPr>
-        <w:pStyle w:val="Listapunktowana"/>
+        <w:pStyle w:val="ListBullet"/>
       </w:pPr>
       <w:r>
         <w:t>Dzielenie plików DOCX/PPTX na wiele plików.</w:t>
@@ -610,7 +616,7 @@
     </w:p>
     <w:p>
       <w:pPr>
-        <w:pStyle w:val="Listapunktowana"/>
+        <w:pStyle w:val="ListBullet"/>
       </w:pPr>
       <w:r>
         <w:t>Łączenie wielu plików DOCX/PPTX w jeden plik.</w:t>
@@ -618,7 +624,7 @@
     </w:p>
     <w:p>
       <w:pPr>
-        <w:pStyle w:val="Listapunktowana"/>
+        <w:pStyle w:val="ListBullet"/>
       </w:pPr>
       <w:r>
         <w:t>Wypełnianie treści w plikach szablonów DOCX danymi z XML.</w:t>
@@ -626,7 +632,7 @@
     </w:p>
     <w:p>
       <w:pPr>
-        <w:pStyle w:val="Listapunktowana"/>
+        <w:pStyle w:val="ListBullet"/>
       </w:pPr>
       <w:r>
         <w:t>Wysokiej jakości konwersja DOCX do HTML/CSS</w:t>
@@ -637,7 +643,7 @@
     </w:p>
     <w:p>
       <w:pPr>
-        <w:pStyle w:val="Listapunktowana"/>
+        <w:pStyle w:val="ListBullet"/>
       </w:pPr>
       <w:r>
         <w:t>Wyszukiwanie i zastępowanie treści w DOCX/PPTX za pomocą wyrażeń regularnych.</w:t>
@@ -645,7 +651,7 @@
     </w:p>
     <w:p>
       <w:pPr>
-        <w:pStyle w:val="Listapunktowana"/>
+        <w:pStyle w:val="ListBullet"/>
       </w:pPr>
       <w:r>
         <w:t>Zarządzanie śledzonymi wersjami, w tym wykrywanie śledzonych wersji i akceptowanie śledzonych wersji.</w:t>
@@ -653,7 +659,7 @@
     </w:p>
     <w:p>
       <w:pPr>
-        <w:pStyle w:val="Listapunktowana"/>
+        <w:pStyle w:val="ListBullet"/>
       </w:pPr>
       <w:r>
         <w:t>Aktualizacja wykresów w plikach DOCX/PPTX, w tym aktualizacja danych z pamięci podręcznej, a także osadzonego XLSX.</w:t>
@@ -661,7 +667,7 @@
     </w:p>
     <w:p>
       <w:pPr>
-        <w:pStyle w:val="Listapunktowana"/>
+        <w:pStyle w:val="ListBullet"/>
       </w:pPr>
       <w:r>
         <w:t>Pobieranie metryk z plików DOCX, w tym hierarchii używanych stylów, używanych języków i używanych czcionek.</w:t>
@@ -669,7 +675,7 @@
     </w:p>
     <w:p>
       <w:pPr>
-        <w:pStyle w:val="Listapunktowana"/>
+        <w:pStyle w:val="ListBullet"/>
       </w:pPr>
       <w:r>
         <w:t>Pisanie plików XLSX przy użyciu znacznie prostszego kodu niż bezpośrednie pisanie znaczników, w tym podejście strumieniowe, które umożliwia pisanie plików XLSX z milionami wierszy.</w:t>
@@ -677,7 +683,7 @@
     </w:p>
     <w:p>
       <w:pPr>
-        <w:pStyle w:val="Listapunktowana"/>
+        <w:pStyle w:val="ListBullet"/>
       </w:pPr>
       <w:r>
         <w:t>Wyodrębnianie danych (wraz z formatowaniem) z arkuszy kalkulacyjnych.</w:t>
@@ -685,7 +691,7 @@
     </w:p>
     <w:p>
       <w:pPr>
-        <w:pStyle w:val="Wcicienormalne"/>
+        <w:pStyle w:val="NormalIndent"/>
       </w:pPr>
       <w:r>
         <w:t xml:space="preserve">Jednak głównym problemem jest fakt, że model obiektowy </w:t>
@@ -750,208 +756,136 @@
     </w:p>
     <w:p>
       <w:pPr>
-        <w:pStyle w:val="Wcicienormalne"/>
-      </w:pPr>
-      <w:r>
-        <w:t>Powyższe problemy ujawniły potrzebę stworzenia pełnego modelu obiektowego dokumentu, który ułatwiłby przetwarzanie obiektowe elementów dokumentu, w tym definiowanie</w:t>
-      </w:r>
-      <w:r>
-        <w:t xml:space="preserve"> klas, które aktualnie nie istnieją w modelu dokument Docx. </w:t>
+        <w:pStyle w:val="NormalIndent"/>
+      </w:pPr>
+      <w:r>
+        <w:t xml:space="preserve">Powyższe problemy ujawniły potrzebę stworzenia pełnego modelu obiektowego dokumentu, który ułatwiłby przetwarzanie obiektowe elementów dokumentu, w tym definiowanie klas, które aktualnie nie istnieją w standardzie </w:t>
+      </w:r>
+      <w:r>
+        <w:rPr>
+          <w:rStyle w:val="NazwaProgramowa"/>
+        </w:rPr>
+        <w:t>DocumentFormat.OpenXml</w:t>
+      </w:r>
+      <w:r>
+        <w:t xml:space="preserve">. </w:t>
       </w:r>
     </w:p>
     <w:p>
       <w:pPr>
-        <w:pStyle w:val="Wcicienormalne"/>
-      </w:pPr>
-      <w:r>
-        <w:t xml:space="preserve">Przykładem zastosowania takiego modelu może być aplikacja do edycji dokumentacji projektów informatycznych. Istnieje wiele aplikacji tego typu wykorzystujących różne sposoby i formaty zapisu. </w:t>
-      </w:r>
-      <w:r>
-        <w:t xml:space="preserve">Nie chodzi tu o </w:t>
-      </w:r>
-      <w:r>
-        <w:t xml:space="preserve">tylko </w:t>
-      </w:r>
-      <w:r>
-        <w:t xml:space="preserve">takie aplikacje jak Doxygen, które służą do generowania dokumentów PDF czy HTML z komentarzy zawartych w kodzie źródłowym. Chodzi </w:t>
-      </w:r>
-      <w:r>
-        <w:t>także</w:t>
-      </w:r>
-      <w:r>
-        <w:t xml:space="preserve"> o aplikacje do tworzenia dokumentów bardziej opisowych, służących zrozumieniu idei projektu, wymagań projektowych, czy też projektu architektury. Tu zasadniczo dostępne są proste aplikacje do</w:t>
-      </w:r>
-      <w:r>
-        <w:t xml:space="preserve"> </w:t>
-      </w:r>
-      <w:r>
-        <w:t xml:space="preserve">edycji </w:t>
-      </w:r>
-      <w:r>
-        <w:t>tekstu</w:t>
-      </w:r>
-      <w:r>
-        <w:t xml:space="preserve"> formatowanego</w:t>
-      </w:r>
-      <w:r>
-        <w:t xml:space="preserve"> (np. </w:t>
-      </w:r>
-      <w:r>
-        <w:t>w formacie Wiki lub Markdown</w:t>
-      </w:r>
-      <w:r>
-        <w:t>)</w:t>
-      </w:r>
-      <w:r>
-        <w:t xml:space="preserve"> albo</w:t>
-      </w:r>
-      <w:r>
-        <w:t xml:space="preserve"> złożone systemy do modelowania graficznego (np. Visual Paradigm, Enterprise Architect). </w:t>
-      </w:r>
-      <w:r>
-        <w:t xml:space="preserve">Brakuje </w:t>
-      </w:r>
-      <w:r>
-        <w:t>aplikacji łączących możliwości tych wszystkich aplikacji i systemów.</w:t>
+        <w:pStyle w:val="Heading2"/>
+      </w:pPr>
+      <w:r>
+        <w:t>Koncepcja aplikacji do edycji dokumentów</w:t>
       </w:r>
     </w:p>
     <w:p>
       <w:pPr>
-        <w:pStyle w:val="Wcicienormalne"/>
-      </w:pPr>
-      <w:r>
-        <w:t xml:space="preserve">Taka aplikacja pobierałaby dane z systemu deweloperskiego (np. typu Visual Studio albo Idea) i prezentowałaby je w dokumencie </w:t>
-      </w:r>
-      <w:r>
-        <w:t>procesora tekstu (takim jak Word)</w:t>
-      </w:r>
-      <w:r>
-        <w:t xml:space="preserve">, który zawierałby opisy, specyfikacje i diagramy. </w:t>
-      </w:r>
-      <w:r>
-        <w:t xml:space="preserve">Taka dokumentacja musi być redagowana w sposób usystematyzowany i kontrolowany. Musi odzwierciedlać rzeczywistą strukturę „logiczną” projektu, ale z drugiej strony też umożliwiać elastyczną prezentację tej struktury. Tak więc dokument powinien zawierać „logiczne” elementy projektowe </w:t>
-      </w:r>
-      <w:r>
-        <w:t xml:space="preserve">oraz umożliwiać ich prezentowanie w treści „wizualnej” dokumentu poprzez ich powiązanie z takimi elementami „wizualnymi” jak </w:t>
-      </w:r>
-      <w:r>
-        <w:t xml:space="preserve">tekst formatowany, </w:t>
-      </w:r>
-      <w:r>
-        <w:t>tabela</w:t>
-      </w:r>
-      <w:r>
-        <w:t xml:space="preserve"> czy diagram.</w:t>
+        <w:pStyle w:val="NormalIndent"/>
+      </w:pPr>
+      <w:r>
+        <w:t xml:space="preserve">Przykładem zastosowania takiego modelu może być aplikacja do edycji dokumentacji projektów informatycznych. Istnieje wiele aplikacji tego typu wykorzystujących różne sposoby i formaty zapisu. </w:t>
+      </w:r>
+      <w:r>
+        <w:t xml:space="preserve">Nie chodzi tu o </w:t>
+      </w:r>
+      <w:r>
+        <w:t xml:space="preserve">tylko </w:t>
+      </w:r>
+      <w:r>
+        <w:t xml:space="preserve">takie aplikacje jak Doxygen, które służą do generowania dokumentów PDF czy HTML z komentarzy zawartych w kodzie źródłowym. Chodzi </w:t>
+      </w:r>
+      <w:r>
+        <w:t>także</w:t>
+      </w:r>
+      <w:r>
+        <w:t xml:space="preserve"> o aplikacje do tworzenia dokumentów bardziej opisowych, służących zrozumieniu idei projektu, wymagań projektowych, czy też projektu architektury. Tu zasadniczo dostępne są proste aplikacje do</w:t>
       </w:r>
       <w:r>
         <w:t xml:space="preserve"> </w:t>
+      </w:r>
+      <w:r>
+        <w:t xml:space="preserve">edycji </w:t>
+      </w:r>
+      <w:r>
+        <w:t>tekstu</w:t>
+      </w:r>
+      <w:r>
+        <w:t xml:space="preserve"> formatowanego</w:t>
+      </w:r>
+      <w:r>
+        <w:t xml:space="preserve"> (np. </w:t>
+      </w:r>
+      <w:r>
+        <w:t>w formacie Wiki lub Markdown</w:t>
+      </w:r>
+      <w:r>
+        <w:t>)</w:t>
+      </w:r>
+      <w:r>
+        <w:t xml:space="preserve"> albo</w:t>
+      </w:r>
+      <w:r>
+        <w:t xml:space="preserve"> złożone systemy do modelowania graficznego (np. Visual Paradigm, Enterprise Architect). </w:t>
+      </w:r>
+      <w:r>
+        <w:t xml:space="preserve">Brakuje </w:t>
+      </w:r>
+      <w:r>
+        <w:t>aplikacji łączących możliwości tych wszystkich aplikacji i systemów.</w:t>
       </w:r>
     </w:p>
     <w:p>
       <w:pPr>
-        <w:pStyle w:val="Wcicienormalne"/>
-      </w:pPr>
+        <w:pStyle w:val="NormalIndent"/>
+      </w:pPr>
+      <w:r>
+        <w:t xml:space="preserve">Taka aplikacja pobierałaby dane z systemu deweloperskiego (np. typu Visual Studio albo Idea) i prezentowałaby je w dokumencie </w:t>
+      </w:r>
+      <w:r>
+        <w:t>procesora tekstu (takim jak Word)</w:t>
+      </w:r>
+      <w:r>
+        <w:t xml:space="preserve">, który zawierałby opisy, specyfikacje i diagramy. </w:t>
+      </w:r>
+      <w:r>
+        <w:t xml:space="preserve">Taka dokumentacja musi być redagowana w sposób usystematyzowany i kontrolowany. Musi odzwierciedlać rzeczywistą strukturę „logiczną” projektu, ale z drugiej strony też umożliwiać elastyczną prezentację tej struktury. Tak więc dokument powinien zawierać „logiczne” elementy projektowe </w:t>
+      </w:r>
+      <w:r>
+        <w:t xml:space="preserve">oraz </w:t>
+      </w:r>
       <w:r>
         <w:lastRenderedPageBreak/>
-        <w:t xml:space="preserve">Taka koncepcja wykorzystania edytora Word do redagowania dokumentacji projektowej wymaga połączenia ze sobą przynajmniej dwóch przedstawionych powyżej rozwiązań technicznych. </w:t>
-      </w:r>
-      <w:r>
-        <w:t xml:space="preserve">Z jednej strony wymagane jest współdziałanie specjalnie napisanej aplikacji projektowej z uruchomioną aplikacją Worda, w tym przechwytywanie zdarzeń występujących w aplikacji Worda (np. przejście autora do redagowania tabeli specyfikacyjnej). Jest to możliwe przy wykorzystaniu automatyzacji VSTO. Z drugiej strony wymagany jest dostęp do wewnętrznej struktury dokumentu, co jest możliwe jedynie poprzez </w:t>
-      </w:r>
-      <w:r>
-        <w:rPr>
-          <w:rStyle w:val="NazwaProgramowa"/>
-        </w:rPr>
-        <w:t>DocumentFormat.OpenXml</w:t>
-      </w:r>
-      <w:r>
-        <w:t>.</w:t>
+        <w:t xml:space="preserve">umożliwiać ich prezentowanie w treści „wizualnej” dokumentu poprzez ich powiązanie z takimi elementami „wizualnymi” jak </w:t>
+      </w:r>
+      <w:r>
+        <w:t xml:space="preserve">tekst formatowany, </w:t>
+      </w:r>
+      <w:r>
+        <w:t>tabela</w:t>
+      </w:r>
+      <w:r>
+        <w:t xml:space="preserve"> czy diagram.</w:t>
+      </w:r>
+      <w:r>
+        <w:t xml:space="preserve"> </w:t>
       </w:r>
     </w:p>
     <w:p>
       <w:pPr>
-        <w:pStyle w:val="Wcicienormalne"/>
-      </w:pPr>
-      <w:r>
-        <w:t xml:space="preserve">Na szczęście niekonieczne jest zapisywanie całego dokumentu Worda w pliku DOCX. Możliwe jest pozyskanie fragmentu dokumentów interfejsie automatyzacji poprzez tzw. </w:t>
-      </w:r>
-      <w:r>
-        <w:rPr>
-          <w:rStyle w:val="NazwaProgramowa"/>
-        </w:rPr>
-        <w:t>„Flat</w:t>
-      </w:r>
-      <w:r>
-        <w:rPr>
-          <w:rStyle w:val="NazwaProgramowa"/>
-        </w:rPr>
-        <w:t>Opc</w:t>
-      </w:r>
-      <w:r>
-        <w:rPr>
-          <w:rStyle w:val="NazwaProgramowa"/>
-        </w:rPr>
-        <w:t>”</w:t>
-      </w:r>
-      <w:r>
-        <w:t xml:space="preserve">. Jest to tekst w formacie XML zawierający „spłaszczoną” strukturę OpenXml, czyli nie zbiór plików XML spakowany formatem ZIP, </w:t>
-      </w:r>
-      <w:r>
-        <w:t>a</w:t>
-      </w:r>
-      <w:r>
-        <w:t xml:space="preserve"> te same dane umieszczone w pojedynczym drzewie elementów OpenXml.</w:t>
-      </w:r>
-      <w:r>
-        <w:t xml:space="preserve"> </w:t>
-      </w:r>
-      <w:r>
-        <w:t xml:space="preserve">Dodatek VSTO może </w:t>
-      </w:r>
-      <w:r>
-        <w:t>pobrać</w:t>
-      </w:r>
-      <w:r>
-        <w:t xml:space="preserve"> fragment dokumentu w formacie FlatOpc</w:t>
-      </w:r>
-      <w:r>
-        <w:t xml:space="preserve"> i przetworzyć na OpenXml</w:t>
-      </w:r>
-      <w:r>
-        <w:t xml:space="preserve"> lub </w:t>
-      </w:r>
-      <w:r>
-        <w:t xml:space="preserve">pobrać </w:t>
-      </w:r>
-      <w:r>
-        <w:t>cały dokument w formacie OpenXml.</w:t>
-      </w:r>
-      <w:r>
-        <w:t xml:space="preserve"> Tak pobrany dokument może przesłać do zewnętrznej aplikacji, która potrafi czytać i zapisywać format OpenXml. Po modyfikacji dokumentu dodatek VSTO powinien zastąpić przesłaną część dokumentu zmodyfikowaną częścią pliku OpenXml.</w:t>
-      </w:r>
-      <w:r>
-        <w:t xml:space="preserve"> Proces ilustruje </w:t>
-      </w:r>
-      <w:r>
-        <w:fldChar w:fldCharType="begin"/>
-      </w:r>
-      <w:r>
-        <w:instrText xml:space="preserve"> REF  _Ref149334100 \* Lower \h </w:instrText>
-      </w:r>
-      <w:r>
-        <w:fldChar w:fldCharType="separate"/>
-      </w:r>
-      <w:r>
-        <w:t xml:space="preserve">rys. </w:t>
-      </w:r>
-      <w:r>
-        <w:rPr>
-          <w:noProof/>
-        </w:rPr>
-        <w:t>1</w:t>
-      </w:r>
-      <w:r>
-        <w:fldChar w:fldCharType="end"/>
+        <w:pStyle w:val="NormalIndent"/>
+      </w:pPr>
+      <w:r>
+        <w:t xml:space="preserve">Taka koncepcja wykorzystania edytora Word do redagowania dokumentacji projektowej wymaga połączenia ze sobą przynajmniej dwóch przedstawionych powyżej rozwiązań technicznych. </w:t>
+      </w:r>
+      <w:r>
+        <w:t xml:space="preserve">Z jednej strony wymagane jest współdziałanie specjalnie napisanej aplikacji projektowej z uruchomioną aplikacją Worda, w tym przechwytywanie zdarzeń występujących w aplikacji Worda (np. przejście autora do redagowania tabeli specyfikacyjnej). Jest to możliwe przy wykorzystaniu automatyzacji VSTO. Z drugiej strony wymagany jest dostęp do wewnętrznej struktury dokumentu, co jest możliwe jedynie poprzez </w:t>
+      </w:r>
+      <w:r>
+        <w:rPr>
+          <w:rStyle w:val="NazwaProgramowa"/>
+        </w:rPr>
+        <w:t>DocumentFormat.OpenXml</w:t>
       </w:r>
       <w:r>
         <w:t>.</w:t>
@@ -959,7 +893,96 @@
     </w:p>
     <w:p>
       <w:pPr>
-        <w:pStyle w:val="Wcicienormalne"/>
+        <w:pStyle w:val="NormalIndent"/>
+      </w:pPr>
+      <w:r>
+        <w:t xml:space="preserve">Na szczęście niekonieczne jest zapisywanie całego dokumentu Worda w pliku DOCX. Możliwe jest pozyskanie fragmentu dokumentów interfejsie automatyzacji poprzez tzw. </w:t>
+      </w:r>
+      <w:r>
+        <w:rPr>
+          <w:rStyle w:val="NazwaProgramowa"/>
+        </w:rPr>
+        <w:t>„Flat</w:t>
+      </w:r>
+      <w:r>
+        <w:rPr>
+          <w:rStyle w:val="NazwaProgramowa"/>
+        </w:rPr>
+        <w:t>Opc</w:t>
+      </w:r>
+      <w:r>
+        <w:rPr>
+          <w:rStyle w:val="NazwaProgramowa"/>
+        </w:rPr>
+        <w:t>”</w:t>
+      </w:r>
+      <w:r>
+        <w:t xml:space="preserve">. Jest to tekst w formacie XML zawierający „spłaszczoną” strukturę OpenXml, czyli nie zbiór plików XML spakowany formatem ZIP, </w:t>
+      </w:r>
+      <w:r>
+        <w:t>a</w:t>
+      </w:r>
+      <w:r>
+        <w:t xml:space="preserve"> te same dane umieszczone w pojedynczym drzewie elementów OpenXml.</w:t>
+      </w:r>
+      <w:r>
+        <w:t xml:space="preserve"> </w:t>
+      </w:r>
+      <w:r>
+        <w:t xml:space="preserve">Dodatek VSTO może </w:t>
+      </w:r>
+      <w:r>
+        <w:t>pobrać</w:t>
+      </w:r>
+      <w:r>
+        <w:t xml:space="preserve"> fragment dokumentu w formacie FlatOpc</w:t>
+      </w:r>
+      <w:r>
+        <w:t xml:space="preserve"> i przetworzyć na OpenXml</w:t>
+      </w:r>
+      <w:r>
+        <w:t xml:space="preserve"> lub </w:t>
+      </w:r>
+      <w:r>
+        <w:t xml:space="preserve">pobrać </w:t>
+      </w:r>
+      <w:r>
+        <w:t>cały dokument w formacie OpenXml.</w:t>
+      </w:r>
+      <w:r>
+        <w:t xml:space="preserve"> Tak pobrany dokument może przesłać do zewnętrznej aplikacji, która potrafi czytać i zapisywać format OpenXml. Po modyfikacji dokumentu dodatek VSTO powinien zastąpić przesłaną część dokumentu zmodyfikowaną częścią pliku OpenXml.</w:t>
+      </w:r>
+      <w:r>
+        <w:t xml:space="preserve"> Proces ilustruje </w:t>
+      </w:r>
+      <w:r>
+        <w:fldChar w:fldCharType="begin"/>
+      </w:r>
+      <w:r>
+        <w:instrText xml:space="preserve"> REF  _Ref149334100 \* Lower \h </w:instrText>
+      </w:r>
+      <w:r>
+        <w:fldChar w:fldCharType="separate"/>
+      </w:r>
+      <w:r>
+        <w:t xml:space="preserve">rys. </w:t>
+      </w:r>
+      <w:r>
+        <w:rPr>
+          <w:noProof/>
+        </w:rPr>
+        <w:t>1</w:t>
+      </w:r>
+      <w:r>
+        <w:fldChar w:fldCharType="end"/>
+      </w:r>
+      <w:r>
+        <w:t>.</w:t>
+      </w:r>
+    </w:p>
+    <w:p>
+      <w:pPr>
+        <w:pStyle w:val="NormalIndent"/>
         <w:keepNext/>
         <w:jc w:val="center"/>
       </w:pPr>
@@ -2026,7 +2049,7 @@
     </w:p>
     <w:p>
       <w:pPr>
-        <w:pStyle w:val="Legenda"/>
+        <w:pStyle w:val="Caption"/>
       </w:pPr>
       <w:bookmarkStart w:id="0" w:name="_Ref149334100"/>
       <w:r>
@@ -2047,109 +2070,115 @@
     </w:p>
     <w:p>
       <w:pPr>
-        <w:pStyle w:val="Wcicienormalne"/>
-      </w:pPr>
-      <w:r>
-        <w:t xml:space="preserve">Ideą projektu </w:t>
-      </w:r>
-      <w:r>
-        <w:rPr>
-          <w:rStyle w:val="NazwaProgramowa"/>
-        </w:rPr>
-        <w:t>DocxDocument</w:t>
-      </w:r>
-      <w:r>
-        <w:t xml:space="preserve"> </w:t>
-      </w:r>
-      <w:r>
-        <w:t xml:space="preserve">jest stworzenie „logicznego” modelu obiektowego zgodnego z interfejsem </w:t>
-      </w:r>
-      <w:r>
-        <w:t>automatyzacji</w:t>
-      </w:r>
-      <w:r>
-        <w:t xml:space="preserve"> Word w oparciu o „fizyczny” model obiektowy OpenXml. Wówczas deweloper tworzący aplikację zewnętrzną będzie mógł się posługiwać się klasami ułatwiającymi przetwarzanie logicznej struktury dokumentu </w:t>
-      </w:r>
-      <w:r>
-        <w:t>Docx</w:t>
-      </w:r>
-      <w:r>
-        <w:t xml:space="preserve"> w formacie OpenXml.</w:t>
+        <w:pStyle w:val="Heading2"/>
+      </w:pPr>
+      <w:r>
+        <w:t>Model obiektowy</w:t>
       </w:r>
     </w:p>
     <w:p>
       <w:pPr>
-        <w:pStyle w:val="Wcicienormalne"/>
-      </w:pPr>
-      <w:r>
-        <w:t>Podstawą definicji nowego modelu obiektowego dokumentu jest model „fizyczny” OpenXml. Na nim nabudowany jest model „logiczny” wzorowany na interfejsie VSTO</w:t>
-      </w:r>
-      <w:r>
-        <w:t xml:space="preserve"> InteropWord</w:t>
+        <w:pStyle w:val="NormalIndent"/>
+      </w:pPr>
+      <w:r>
+        <w:t xml:space="preserve">Ideą projektu </w:t>
+      </w:r>
+      <w:r>
+        <w:rPr>
+          <w:rStyle w:val="NazwaProgramowa"/>
+        </w:rPr>
+        <w:t>DocxDocument</w:t>
+      </w:r>
+      <w:r>
+        <w:t xml:space="preserve"> jest stworzenie „logicznego” modelu obiektowego zgodnego z interfejsem </w:t>
+      </w:r>
+      <w:r>
+        <w:t>automatyzacji</w:t>
+      </w:r>
+      <w:r>
+        <w:t xml:space="preserve"> Word w oparciu o „fizyczny” model obiektowy OpenXml. Wówczas deweloper tworzący aplikację zewnętrzną będzie mógł się posługiwać się klasami ułatwiającymi przetwarzanie logicznej struktury dokumentu </w:t>
+      </w:r>
+      <w:r>
+        <w:rPr>
+          <w:rStyle w:val="NazwaProgramowa"/>
+        </w:rPr>
+        <w:t>Docx</w:t>
+      </w:r>
+      <w:r>
+        <w:t xml:space="preserve"> w formacie </w:t>
+      </w:r>
+      <w:r>
+        <w:rPr>
+          <w:rStyle w:val="NazwaProgramowa"/>
+        </w:rPr>
+        <w:t>OpenXml</w:t>
       </w:r>
       <w:r>
         <w:t>.</w:t>
-      </w:r>
-      <w:r>
-        <w:t xml:space="preserve"> Ponieważ zarówno model OpenXml, jak i InteropWord</w:t>
-      </w:r>
-      <w:r>
-        <w:t xml:space="preserve"> zawierają </w:t>
-      </w:r>
-      <w:r>
-        <w:t>ogromną liczbę</w:t>
-      </w:r>
-      <w:r>
-        <w:t xml:space="preserve"> typów (</w:t>
-      </w:r>
-      <w:r>
-        <w:t>OpenXml</w:t>
-      </w:r>
-      <w:r>
-        <w:t xml:space="preserve"> -</w:t>
-      </w:r>
-      <w:r>
-        <w:t xml:space="preserve"> 5105</w:t>
-      </w:r>
-      <w:r>
-        <w:t>,</w:t>
-      </w:r>
-      <w:r>
-        <w:t xml:space="preserve"> </w:t>
-      </w:r>
-      <w:r>
-        <w:t>InteropWord - 867</w:t>
-      </w:r>
-      <w:r>
-        <w:t>)</w:t>
-      </w:r>
-      <w:r>
-        <w:t xml:space="preserve">, więc potrzebne jest narzędzie do </w:t>
-      </w:r>
-      <w:r>
-        <w:t>wspomagania</w:t>
-      </w:r>
-      <w:r>
-        <w:t xml:space="preserve"> generowania nowego modelu na podstawie tych dwóch.</w:t>
       </w:r>
     </w:p>
     <w:p>
       <w:pPr>
-        <w:pStyle w:val="Nagwek1"/>
-      </w:pPr>
-      <w:r>
-        <w:t xml:space="preserve">Oczekiwany </w:t>
-      </w:r>
-      <w:r>
-        <w:t>wynik</w:t>
+        <w:pStyle w:val="NormalIndent"/>
+      </w:pPr>
+      <w:r>
+        <w:t xml:space="preserve">Podstawą definicji nowego modelu obiektowego dokumentu jest model „fizyczny” OpenXml. Na nim nabudowany jest model „logiczny” wzorowany na interfejsie VSTO </w:t>
+      </w:r>
+      <w:r>
+        <w:rPr>
+          <w:rStyle w:val="NazwaProgramowa"/>
+        </w:rPr>
+        <w:t>InteropWord</w:t>
+      </w:r>
+      <w:r>
+        <w:t xml:space="preserve">. Ponieważ zarówno model OpenXml, jak i </w:t>
+      </w:r>
+      <w:r>
+        <w:rPr>
+          <w:rStyle w:val="NazwaProgramowa"/>
+        </w:rPr>
+        <w:t>InteropWord</w:t>
+      </w:r>
+      <w:r>
+        <w:t xml:space="preserve"> zawierają ogromną liczbę typów (</w:t>
+      </w:r>
+      <w:r>
+        <w:rPr>
+          <w:rStyle w:val="NazwaProgramowa"/>
+        </w:rPr>
+        <w:t>OpenXml</w:t>
+      </w:r>
+      <w:r>
+        <w:t xml:space="preserve"> - 5105, </w:t>
+      </w:r>
+      <w:r>
+        <w:rPr>
+          <w:rStyle w:val="NazwaProgramowa"/>
+        </w:rPr>
+        <w:t>InteropWord</w:t>
+      </w:r>
+      <w:r>
+        <w:t xml:space="preserve"> - 867), więc potrzebne jest narzędzie do wspomagania generowania nowego modelu na podstawie tych dwóch.</w:t>
       </w:r>
     </w:p>
     <w:p>
       <w:pPr>
-        <w:pStyle w:val="Wcicienormalne"/>
-      </w:pPr>
-      <w:r>
-        <w:t>Oczekiwanym wynikiem działania generatora jest model obiektowy dokumentu, którego elementy (klasy) reprezentują pojęcia</w:t>
+        <w:pStyle w:val="NormalIndent"/>
+      </w:pPr>
+      <w:r>
+        <w:t xml:space="preserve">Projekt </w:t>
+      </w:r>
+      <w:r>
+        <w:rPr>
+          <w:rStyle w:val="NazwaProgramowa"/>
+        </w:rPr>
+        <w:t>DocxDocument</w:t>
+      </w:r>
+      <w:r>
+        <w:t xml:space="preserve"> bazuje na modelu obiektowym dokumentu. Jego</w:t>
+      </w:r>
+      <w:r>
+        <w:t xml:space="preserve"> elementy (klasy) reprezentują pojęcia</w:t>
       </w:r>
       <w:r>
         <w:t xml:space="preserve"> „logiczne”, znane</w:t>
@@ -2160,17 +2189,29 @@
     </w:p>
     <w:p>
       <w:pPr>
-        <w:pStyle w:val="Wcicienormalne"/>
+        <w:pStyle w:val="NormalIndent"/>
       </w:pPr>
       <w:r>
         <w:lastRenderedPageBreak/>
         <w:t>Na przykład g</w:t>
       </w:r>
       <w:r>
-        <w:t xml:space="preserve">łówną klasą OpenXml odczytywaną z pakietu </w:t>
-      </w:r>
-      <w:r>
-        <w:t>Docx</w:t>
+        <w:t xml:space="preserve">łówną klasą </w:t>
+      </w:r>
+      <w:r>
+        <w:rPr>
+          <w:rStyle w:val="NazwaProgramowa"/>
+        </w:rPr>
+        <w:t>OpenXml</w:t>
+      </w:r>
+      <w:r>
+        <w:t xml:space="preserve"> odczytywaną z </w:t>
+      </w:r>
+      <w:r>
+        <w:t xml:space="preserve">pakietu </w:t>
+      </w:r>
+      <w:r>
+        <w:t>dokumentu</w:t>
       </w:r>
       <w:r>
         <w:t xml:space="preserve"> jest </w:t>
@@ -2362,7 +2403,7 @@
     </w:p>
     <w:p>
       <w:pPr>
-        <w:pStyle w:val="Wcicienormalne"/>
+        <w:pStyle w:val="NormalIndent"/>
         <w:keepNext/>
       </w:pPr>
       <w:r>
@@ -3693,7 +3734,7 @@
     </w:p>
     <w:p>
       <w:pPr>
-        <w:pStyle w:val="Legenda"/>
+        <w:pStyle w:val="Caption"/>
       </w:pPr>
       <w:bookmarkStart w:id="1" w:name="_Ref149728641"/>
       <w:r>
@@ -3714,7 +3755,7 @@
     </w:p>
     <w:p>
       <w:pPr>
-        <w:pStyle w:val="Wcicienormalne"/>
+        <w:pStyle w:val="NormalIndent"/>
       </w:pPr>
       <w:r>
         <w:t xml:space="preserve">Klasa </w:t>
@@ -3729,7 +3770,7 @@
         <w:t xml:space="preserve"> </w:t>
       </w:r>
       <w:r>
-        <w:t xml:space="preserve">z przestrzeni nazw </w:t>
+        <w:t xml:space="preserve">w modelu </w:t>
       </w:r>
       <w:r>
         <w:rPr>
@@ -3738,7 +3779,10 @@
         <w:t>DocumentModel</w:t>
       </w:r>
       <w:r>
-        <w:t xml:space="preserve"> reprezentuje klasę </w:t>
+        <w:t xml:space="preserve"> </w:t>
+      </w:r>
+      <w:r>
+        <w:t xml:space="preserve">reprezentuje klasę </w:t>
       </w:r>
       <w:r>
         <w:rPr>
@@ -3785,6 +3829,1491 @@
       <w:r>
         <w:t xml:space="preserve"> Ta pierwsza zawiera właściwości związane z pakietem ZIP, a druga – z dokumentem aplikacji Office.</w:t>
       </w:r>
+    </w:p>
+    <w:p>
+      <w:pPr>
+        <w:pStyle w:val="Heading1"/>
+      </w:pPr>
+      <w:r>
+        <w:t>P</w:t>
+      </w:r>
+      <w:r>
+        <w:t>rojekt</w:t>
+      </w:r>
+      <w:r>
+        <w:t>y</w:t>
+      </w:r>
+      <w:r>
+        <w:t xml:space="preserve"> </w:t>
+      </w:r>
+      <w:r>
+        <w:rPr>
+          <w:rStyle w:val="NazwaProgramowa"/>
+        </w:rPr>
+        <w:t>DocxDocument</w:t>
+      </w:r>
+    </w:p>
+    <w:p>
+      <w:pPr>
+        <w:pStyle w:val="NormalIndent"/>
+      </w:pPr>
+      <w:r>
+        <w:rPr>
+          <w:rStyle w:val="NazwaProgramowa"/>
+        </w:rPr>
+        <w:t>DocxDocument</w:t>
+      </w:r>
+      <w:r>
+        <w:t xml:space="preserve"> to nie jeden, a wiele projektów (ang. </w:t>
+      </w:r>
+      <w:r>
+        <w:rPr>
+          <w:rStyle w:val="angielskawstawka"/>
+        </w:rPr>
+        <w:t>project</w:t>
+      </w:r>
+      <w:r>
+        <w:t xml:space="preserve">) </w:t>
+      </w:r>
+      <w:r>
+        <w:t>tworzących</w:t>
+      </w:r>
+      <w:r>
+        <w:t xml:space="preserve"> różne rozwiązania (ang. </w:t>
+      </w:r>
+      <w:r>
+        <w:rPr>
+          <w:rStyle w:val="angielskawstawka"/>
+        </w:rPr>
+        <w:t>solutions</w:t>
+      </w:r>
+      <w:r>
+        <w:t>) Visual Studio. Są to</w:t>
+      </w:r>
+      <w:r>
+        <w:t xml:space="preserve"> (w kolejności alfabetycznej):</w:t>
+      </w:r>
+    </w:p>
+    <w:p>
+      <w:pPr>
+        <w:pStyle w:val="NormalIndent"/>
+        <w:numPr>
+          <w:ilvl w:val="0"/>
+          <w:numId w:val="52"/>
+        </w:numPr>
+        <w:ind w:left="1068"/>
+        <w:rPr>
+          <w:rStyle w:val="NazwaProgramowa"/>
+        </w:rPr>
+      </w:pPr>
+      <w:r>
+        <w:rPr>
+          <w:rStyle w:val="NazwaProgramowa"/>
+        </w:rPr>
+        <w:t>AnalyzeModelTypeMapping</w:t>
+      </w:r>
+      <w:r>
+        <w:rPr>
+          <w:rStyle w:val="NazwaProgramowa"/>
+        </w:rPr>
+        <w:t xml:space="preserve"> </w:t>
+      </w:r>
+      <w:r>
+        <w:t xml:space="preserve">– zawiera program do analizy odwzorowania typów modelu dokumentu (z przestrzeni </w:t>
+      </w:r>
+      <w:r>
+        <w:rPr>
+          <w:rStyle w:val="NazwaProgramowa"/>
+        </w:rPr>
+        <w:t>DocumentModel</w:t>
+      </w:r>
+      <w:r>
+        <w:t xml:space="preserve">) w klasy modelu </w:t>
+      </w:r>
+      <w:r>
+        <w:rPr>
+          <w:rStyle w:val="NazwaProgramowa"/>
+        </w:rPr>
+        <w:t>DocumentFormat.OpenXml</w:t>
+      </w:r>
+      <w:r>
+        <w:t>.</w:t>
+      </w:r>
+    </w:p>
+    <w:p>
+      <w:pPr>
+        <w:pStyle w:val="NormalIndent"/>
+        <w:numPr>
+          <w:ilvl w:val="0"/>
+          <w:numId w:val="52"/>
+        </w:numPr>
+        <w:ind w:left="1068"/>
+        <w:rPr>
+          <w:rStyle w:val="NazwaProgramowa"/>
+        </w:rPr>
+      </w:pPr>
+      <w:r>
+        <w:rPr>
+          <w:rStyle w:val="NazwaProgramowa"/>
+        </w:rPr>
+        <w:lastRenderedPageBreak/>
+        <w:t>Analyzers</w:t>
+      </w:r>
+      <w:r>
+        <w:t xml:space="preserve"> </w:t>
+      </w:r>
+      <w:r>
+        <w:t>–</w:t>
+      </w:r>
+      <w:r>
+        <w:t xml:space="preserve"> z</w:t>
+      </w:r>
+      <w:r>
+        <w:t>awiera nie</w:t>
+      </w:r>
+      <w:r>
+        <w:t xml:space="preserve">rozwiniętą próbę napisania dodatku do sprawdzania czy klasy modelu dokumentu mają funkcje </w:t>
+      </w:r>
+      <w:r>
+        <w:rPr>
+          <w:rStyle w:val="NazwaProgramowa"/>
+        </w:rPr>
+        <w:t>ShouldSerialize</w:t>
+      </w:r>
+      <w:r>
+        <w:t xml:space="preserve"> wykorzystywane przez serializator XML.</w:t>
+      </w:r>
+    </w:p>
+    <w:p>
+      <w:pPr>
+        <w:pStyle w:val="NormalIndent"/>
+        <w:numPr>
+          <w:ilvl w:val="0"/>
+          <w:numId w:val="52"/>
+        </w:numPr>
+        <w:ind w:left="1068"/>
+        <w:rPr>
+          <w:rStyle w:val="NazwaProgramowa"/>
+        </w:rPr>
+      </w:pPr>
+      <w:r>
+        <w:rPr>
+          <w:rStyle w:val="NazwaProgramowa"/>
+        </w:rPr>
+        <w:t>AutoEdit</w:t>
+      </w:r>
+      <w:r>
+        <w:t xml:space="preserve"> – zawiera program</w:t>
+      </w:r>
+      <w:r>
+        <w:t xml:space="preserve"> do automatycznej edycji plików modelu dokumentu z uzupełnianiem atrybutów klas i dodawaniem funkcji </w:t>
+      </w:r>
+      <w:r>
+        <w:rPr>
+          <w:rStyle w:val="NazwaProgramowa"/>
+        </w:rPr>
+        <w:t>ShouldSerialize</w:t>
+      </w:r>
+      <w:r>
+        <w:t>.</w:t>
+      </w:r>
+    </w:p>
+    <w:p>
+      <w:pPr>
+        <w:pStyle w:val="NormalIndent"/>
+        <w:numPr>
+          <w:ilvl w:val="0"/>
+          <w:numId w:val="52"/>
+        </w:numPr>
+        <w:ind w:left="1068"/>
+        <w:rPr>
+          <w:rStyle w:val="NazwaProgramowa"/>
+        </w:rPr>
+      </w:pPr>
+      <w:r>
+        <w:rPr>
+          <w:rStyle w:val="NazwaProgramowa"/>
+        </w:rPr>
+        <w:t>CleanOpenXml</w:t>
+      </w:r>
+      <w:r>
+        <w:t xml:space="preserve"> – zawiera program do „czyszczenia” dokumentu Docx, w tym usuwania niepotrzebnych spacji i pustych akapitów.</w:t>
+      </w:r>
+    </w:p>
+    <w:p>
+      <w:pPr>
+        <w:pStyle w:val="NormalIndent"/>
+        <w:numPr>
+          <w:ilvl w:val="0"/>
+          <w:numId w:val="52"/>
+        </w:numPr>
+        <w:ind w:left="1068"/>
+        <w:rPr>
+          <w:rStyle w:val="NazwaProgramowa"/>
+        </w:rPr>
+      </w:pPr>
+      <w:r>
+        <w:rPr>
+          <w:rStyle w:val="NazwaProgramowa"/>
+        </w:rPr>
+        <w:t>CodeFix</w:t>
+      </w:r>
+      <w:r>
+        <w:rPr>
+          <w:rStyle w:val="NazwaProgramowa"/>
+        </w:rPr>
+        <w:t xml:space="preserve"> </w:t>
+      </w:r>
+      <w:r>
+        <w:t>– zawiera nierozwiniętą próbę napisania programu do czyszczenia kodu modelu dokumentu z wykorzystaniem kompilatora Roslyn języka C#.</w:t>
+      </w:r>
+    </w:p>
+    <w:p>
+      <w:pPr>
+        <w:pStyle w:val="NormalIndent"/>
+        <w:numPr>
+          <w:ilvl w:val="0"/>
+          <w:numId w:val="52"/>
+        </w:numPr>
+        <w:ind w:left="1068"/>
+        <w:rPr>
+          <w:rStyle w:val="NazwaProgramowa"/>
+        </w:rPr>
+      </w:pPr>
+      <w:r>
+        <w:rPr>
+          <w:rStyle w:val="NazwaProgramowa"/>
+        </w:rPr>
+        <w:t>DocumentModel</w:t>
+      </w:r>
+      <w:r>
+        <w:t xml:space="preserve"> </w:t>
+      </w:r>
+      <w:r>
+        <w:t>–</w:t>
+      </w:r>
+      <w:r>
+        <w:t xml:space="preserve"> za</w:t>
+      </w:r>
+      <w:r>
+        <w:t>wiera model dokumentu w formie interfejsów.</w:t>
+      </w:r>
+    </w:p>
+    <w:p>
+      <w:pPr>
+        <w:pStyle w:val="NormalIndent"/>
+        <w:numPr>
+          <w:ilvl w:val="0"/>
+          <w:numId w:val="52"/>
+        </w:numPr>
+        <w:ind w:left="1068"/>
+        <w:rPr>
+          <w:rStyle w:val="NazwaProgramowa"/>
+        </w:rPr>
+      </w:pPr>
+      <w:r>
+        <w:rPr>
+          <w:rStyle w:val="NazwaProgramowa"/>
+        </w:rPr>
+        <w:t>DocumentModel.Attributes</w:t>
+      </w:r>
+      <w:r>
+        <w:rPr>
+          <w:rStyle w:val="NazwaProgramowa"/>
+        </w:rPr>
+        <w:t xml:space="preserve"> </w:t>
+      </w:r>
+      <w:r>
+        <w:t>– zawiera definicje atrybutów wykorzystywanych do generowania modelu dokumentu.</w:t>
+      </w:r>
+    </w:p>
+    <w:p>
+      <w:pPr>
+        <w:pStyle w:val="NormalIndent"/>
+        <w:numPr>
+          <w:ilvl w:val="0"/>
+          <w:numId w:val="52"/>
+        </w:numPr>
+        <w:ind w:left="1068"/>
+        <w:rPr>
+          <w:rStyle w:val="NazwaProgramowa"/>
+        </w:rPr>
+      </w:pPr>
+      <w:r>
+        <w:rPr>
+          <w:rStyle w:val="NazwaProgramowa"/>
+        </w:rPr>
+        <w:t>DocumentModel.BaseConverters</w:t>
+      </w:r>
+      <w:r>
+        <w:t xml:space="preserve"> – zawiera podstawowe konwertery klas modelu OpenXml na/do typów modelu dokumentu.</w:t>
+      </w:r>
+    </w:p>
+    <w:p>
+      <w:pPr>
+        <w:pStyle w:val="NormalIndent"/>
+        <w:numPr>
+          <w:ilvl w:val="0"/>
+          <w:numId w:val="52"/>
+        </w:numPr>
+        <w:ind w:left="1068"/>
+        <w:rPr>
+          <w:rStyle w:val="NazwaProgramowa"/>
+        </w:rPr>
+      </w:pPr>
+      <w:r>
+        <w:rPr>
+          <w:rStyle w:val="NazwaProgramowa"/>
+        </w:rPr>
+        <w:t>DocumentModel.BaseConverters.Test</w:t>
+      </w:r>
+      <w:r>
+        <w:t xml:space="preserve"> </w:t>
+      </w:r>
+      <w:r>
+        <w:t>–</w:t>
+      </w:r>
+      <w:r>
+        <w:t xml:space="preserve"> zaw</w:t>
+      </w:r>
+      <w:r>
+        <w:t xml:space="preserve">iera </w:t>
+      </w:r>
+      <w:r>
+        <w:t xml:space="preserve">program </w:t>
+      </w:r>
+      <w:r>
+        <w:t>test</w:t>
+      </w:r>
+      <w:r>
+        <w:t>owy</w:t>
+      </w:r>
+      <w:r>
+        <w:t xml:space="preserve"> podstawowych konwerterów z projektu </w:t>
+      </w:r>
+      <w:r>
+        <w:rPr>
+          <w:rStyle w:val="NazwaProgramowa"/>
+        </w:rPr>
+        <w:t>D</w:t>
+      </w:r>
+      <w:r>
+        <w:rPr>
+          <w:rStyle w:val="NazwaProgramowa"/>
+        </w:rPr>
+        <w:t>o</w:t>
+      </w:r>
+      <w:r>
+        <w:rPr>
+          <w:rStyle w:val="NazwaProgramowa"/>
+        </w:rPr>
+        <w:t>cumentModel.BaseConverters</w:t>
+      </w:r>
+      <w:r>
+        <w:t>.</w:t>
+      </w:r>
+    </w:p>
+    <w:p>
+      <w:pPr>
+        <w:pStyle w:val="NormalIndent"/>
+        <w:numPr>
+          <w:ilvl w:val="0"/>
+          <w:numId w:val="52"/>
+        </w:numPr>
+        <w:ind w:left="1068"/>
+        <w:rPr>
+          <w:rStyle w:val="NazwaProgramowa"/>
+        </w:rPr>
+      </w:pPr>
+      <w:r>
+        <w:rPr>
+          <w:rStyle w:val="NazwaProgramowa"/>
+        </w:rPr>
+        <w:t>DocumentModel.BaseTypes</w:t>
+      </w:r>
+      <w:r>
+        <w:t xml:space="preserve"> </w:t>
+      </w:r>
+      <w:r>
+        <w:t>–</w:t>
+      </w:r>
+      <w:r>
+        <w:t xml:space="preserve"> za</w:t>
+      </w:r>
+      <w:r>
+        <w:t>wiera podstawowe typy danych dla modelu dokumentu.</w:t>
+      </w:r>
+    </w:p>
+    <w:p>
+      <w:pPr>
+        <w:pStyle w:val="NormalIndent"/>
+        <w:numPr>
+          <w:ilvl w:val="0"/>
+          <w:numId w:val="52"/>
+        </w:numPr>
+        <w:ind w:left="1068"/>
+        <w:rPr>
+          <w:rStyle w:val="NazwaProgramowa"/>
+        </w:rPr>
+      </w:pPr>
+      <w:r>
+        <w:rPr>
+          <w:rStyle w:val="NazwaProgramowa"/>
+        </w:rPr>
+        <w:t>DocumentModel.BaseTypesTest</w:t>
+      </w:r>
+      <w:r>
+        <w:rPr>
+          <w:rStyle w:val="NazwaProgramowa"/>
+        </w:rPr>
+        <w:t xml:space="preserve"> </w:t>
+      </w:r>
+      <w:r>
+        <w:t xml:space="preserve">– zawiera program testowy typów danych z projektu </w:t>
+      </w:r>
+      <w:r>
+        <w:rPr>
+          <w:rStyle w:val="NazwaProgramowa"/>
+        </w:rPr>
+        <w:t>DocumentModel.BaseTypes</w:t>
+      </w:r>
+      <w:r>
+        <w:t>.</w:t>
+      </w:r>
+    </w:p>
+    <w:p>
+      <w:pPr>
+        <w:pStyle w:val="NormalIndent"/>
+        <w:numPr>
+          <w:ilvl w:val="0"/>
+          <w:numId w:val="52"/>
+        </w:numPr>
+        <w:ind w:left="1068"/>
+        <w:rPr>
+          <w:rStyle w:val="NazwaProgramowa"/>
+        </w:rPr>
+      </w:pPr>
+      <w:r>
+        <w:rPr>
+          <w:rStyle w:val="NazwaProgramowa"/>
+        </w:rPr>
+        <w:t>DocumentModel.InOpenXml</w:t>
+      </w:r>
+      <w:r>
+        <w:t xml:space="preserve"> – zawiera klasy modelu dokumentu oparte o klasy OpenXml.</w:t>
+      </w:r>
+    </w:p>
+    <w:p>
+      <w:pPr>
+        <w:pStyle w:val="NormalIndent"/>
+        <w:numPr>
+          <w:ilvl w:val="0"/>
+          <w:numId w:val="52"/>
+        </w:numPr>
+        <w:ind w:left="1068"/>
+        <w:rPr>
+          <w:rStyle w:val="NazwaProgramowa"/>
+        </w:rPr>
+      </w:pPr>
+      <w:r>
+        <w:rPr>
+          <w:rStyle w:val="NazwaProgramowa"/>
+        </w:rPr>
+        <w:t>DocumentModel.InOpenXml.Test</w:t>
+      </w:r>
+      <w:r>
+        <w:t xml:space="preserve"> – zawiera program testowy do klasy z projektu </w:t>
+      </w:r>
+      <w:r>
+        <w:rPr>
+          <w:rStyle w:val="NazwaProgramowa"/>
+        </w:rPr>
+        <w:t>DocumentModel.InOpenXml</w:t>
+      </w:r>
+      <w:r>
+        <w:t>.</w:t>
+      </w:r>
+    </w:p>
+    <w:p>
+      <w:pPr>
+        <w:pStyle w:val="NormalIndent"/>
+        <w:numPr>
+          <w:ilvl w:val="0"/>
+          <w:numId w:val="52"/>
+        </w:numPr>
+        <w:ind w:left="1068"/>
+        <w:rPr>
+          <w:rStyle w:val="NazwaProgramowa"/>
+        </w:rPr>
+      </w:pPr>
+      <w:r>
+        <w:rPr>
+          <w:rStyle w:val="NazwaProgramowa"/>
+        </w:rPr>
+        <w:t>DocumentModel.Interfaces</w:t>
+      </w:r>
+      <w:r>
+        <w:rPr>
+          <w:rStyle w:val="NazwaProgramowa"/>
+        </w:rPr>
+        <w:t xml:space="preserve"> </w:t>
+      </w:r>
+      <w:r>
+        <w:t>– zawiera interfejsy wygenerowane z modelu OpenXml.</w:t>
+      </w:r>
+    </w:p>
+    <w:p>
+      <w:pPr>
+        <w:pStyle w:val="NormalIndent"/>
+        <w:numPr>
+          <w:ilvl w:val="0"/>
+          <w:numId w:val="52"/>
+        </w:numPr>
+        <w:ind w:left="1068"/>
+        <w:rPr>
+          <w:rStyle w:val="NazwaProgramowa"/>
+        </w:rPr>
+      </w:pPr>
+      <w:r>
+        <w:rPr>
+          <w:rStyle w:val="NazwaProgramowa"/>
+        </w:rPr>
+        <w:t>DocumentModel.OpenXml</w:t>
+      </w:r>
+      <w:r>
+        <w:rPr>
+          <w:rStyle w:val="NazwaProgramowa"/>
+        </w:rPr>
+        <w:t xml:space="preserve"> – </w:t>
+      </w:r>
+      <w:r>
+        <w:t>zawiera klasy wygenerowane z modelu OpenXml.</w:t>
+      </w:r>
+    </w:p>
+    <w:p>
+      <w:pPr>
+        <w:pStyle w:val="NormalIndent"/>
+        <w:numPr>
+          <w:ilvl w:val="0"/>
+          <w:numId w:val="52"/>
+        </w:numPr>
+        <w:ind w:left="1068"/>
+        <w:rPr>
+          <w:rStyle w:val="NazwaProgramowa"/>
+        </w:rPr>
+      </w:pPr>
+      <w:r>
+        <w:rPr>
+          <w:rStyle w:val="NazwaProgramowa"/>
+        </w:rPr>
+        <w:t>DocumentModel.VariantTypes</w:t>
+      </w:r>
+      <w:r>
+        <w:t xml:space="preserve"> - zawiera klasy wariantów OpenXml bazujące na klasie </w:t>
+      </w:r>
+      <w:r>
+        <w:rPr>
+          <w:rStyle w:val="NazwaProgramowa"/>
+        </w:rPr>
+        <w:t>Variant</w:t>
+      </w:r>
+      <w:r>
+        <w:t>.</w:t>
+      </w:r>
+    </w:p>
+    <w:p>
+      <w:pPr>
+        <w:pStyle w:val="NormalIndent"/>
+        <w:numPr>
+          <w:ilvl w:val="0"/>
+          <w:numId w:val="52"/>
+        </w:numPr>
+        <w:ind w:left="1068"/>
+        <w:rPr>
+          <w:rStyle w:val="NazwaProgramowa"/>
+        </w:rPr>
+      </w:pPr>
+      <w:r>
+        <w:rPr>
+          <w:rStyle w:val="NazwaProgramowa"/>
+        </w:rPr>
+        <w:t>DocxDocument.Ext</w:t>
+      </w:r>
+      <w:r>
+        <w:t xml:space="preserve"> – zawiera rozszerzenia do programu </w:t>
+      </w:r>
+      <w:r>
+        <w:rPr>
+          <w:rStyle w:val="NazwaProgramowa"/>
+        </w:rPr>
+        <w:t>DocxDocument.Test</w:t>
+      </w:r>
+    </w:p>
+    <w:p>
+      <w:pPr>
+        <w:pStyle w:val="NormalIndent"/>
+        <w:numPr>
+          <w:ilvl w:val="0"/>
+          <w:numId w:val="52"/>
+        </w:numPr>
+        <w:ind w:left="1068"/>
+        <w:rPr>
+          <w:rStyle w:val="NazwaProgramowa"/>
+        </w:rPr>
+      </w:pPr>
+      <w:r>
+        <w:rPr>
+          <w:rStyle w:val="NazwaProgramowa"/>
+        </w:rPr>
+        <w:t>DocxDocument.ReadWrite</w:t>
+      </w:r>
+      <w:r>
+        <w:rPr>
+          <w:rStyle w:val="NazwaProgramowa"/>
+        </w:rPr>
+        <w:t xml:space="preserve"> </w:t>
+      </w:r>
+      <w:r>
+        <w:t xml:space="preserve">– zawiera klasy </w:t>
+      </w:r>
+      <w:r>
+        <w:rPr>
+          <w:rStyle w:val="NazwaProgramowa"/>
+        </w:rPr>
+        <w:t>DocxReader</w:t>
+      </w:r>
+      <w:r>
+        <w:t xml:space="preserve"> i </w:t>
+      </w:r>
+      <w:r>
+        <w:rPr>
+          <w:rStyle w:val="NazwaProgramowa"/>
+        </w:rPr>
+        <w:t>DocxWriter</w:t>
+      </w:r>
+      <w:r>
+        <w:t xml:space="preserve"> do odczytu/zapisu plików Docx.</w:t>
+      </w:r>
+    </w:p>
+    <w:p>
+      <w:pPr>
+        <w:pStyle w:val="NormalIndent"/>
+        <w:numPr>
+          <w:ilvl w:val="0"/>
+          <w:numId w:val="52"/>
+        </w:numPr>
+        <w:ind w:left="1068"/>
+        <w:rPr>
+          <w:rStyle w:val="NazwaProgramowa"/>
+        </w:rPr>
+      </w:pPr>
+      <w:r>
+        <w:rPr>
+          <w:rStyle w:val="NazwaProgramowa"/>
+        </w:rPr>
+        <w:t>DocxDocument.ReadWrite.Test</w:t>
+      </w:r>
+      <w:r>
+        <w:rPr>
+          <w:rStyle w:val="NazwaProgramowa"/>
+        </w:rPr>
+        <w:t xml:space="preserve"> </w:t>
+      </w:r>
+      <w:r>
+        <w:t xml:space="preserve">– zawiera program testowy do projektu </w:t>
+      </w:r>
+      <w:r>
+        <w:rPr>
+          <w:rStyle w:val="NazwaProgramowa"/>
+        </w:rPr>
+        <w:t>DocxDocument.ReadWrite</w:t>
+      </w:r>
+      <w:r>
+        <w:t>.</w:t>
+      </w:r>
+    </w:p>
+    <w:p>
+      <w:pPr>
+        <w:pStyle w:val="NormalIndent"/>
+        <w:numPr>
+          <w:ilvl w:val="0"/>
+          <w:numId w:val="52"/>
+        </w:numPr>
+        <w:ind w:left="1068"/>
+      </w:pPr>
+      <w:r>
+        <w:rPr>
+          <w:rStyle w:val="NazwaProgramowa"/>
+        </w:rPr>
+        <w:t>DocxDocument.Test</w:t>
+      </w:r>
+      <w:r>
+        <w:rPr>
+          <w:rStyle w:val="NazwaProgramowa"/>
+        </w:rPr>
+        <w:t xml:space="preserve"> </w:t>
+      </w:r>
+      <w:r>
+        <w:t>– zawiera program</w:t>
+      </w:r>
+      <w:r>
+        <w:t xml:space="preserve"> testowy do zapisu/odczytu dokumentu.</w:t>
+      </w:r>
+    </w:p>
+    <w:p>
+      <w:pPr>
+        <w:pStyle w:val="NormalIndent"/>
+        <w:numPr>
+          <w:ilvl w:val="0"/>
+          <w:numId w:val="52"/>
+        </w:numPr>
+        <w:ind w:left="1068"/>
+        <w:rPr>
+          <w:rStyle w:val="NazwaProgramowa"/>
+        </w:rPr>
+      </w:pPr>
+      <w:r>
+        <w:rPr>
+          <w:rStyle w:val="NazwaProgramowa"/>
+        </w:rPr>
+        <w:t>DocxEditor</w:t>
+      </w:r>
+      <w:r>
+        <w:t xml:space="preserve"> – zawiera aplikację edytora dokumentu.</w:t>
+      </w:r>
+    </w:p>
+    <w:p>
+      <w:pPr>
+        <w:pStyle w:val="NormalIndent"/>
+        <w:numPr>
+          <w:ilvl w:val="0"/>
+          <w:numId w:val="52"/>
+        </w:numPr>
+        <w:ind w:left="1068"/>
+      </w:pPr>
+      <w:r>
+        <w:rPr>
+          <w:rStyle w:val="NazwaProgramowa"/>
+        </w:rPr>
+        <w:t>DocxEditorWpf_lib</w:t>
+      </w:r>
+      <w:r>
+        <w:t xml:space="preserve"> </w:t>
+      </w:r>
+      <w:r>
+        <w:t>–</w:t>
+      </w:r>
+      <w:r>
+        <w:t xml:space="preserve"> zaw</w:t>
+      </w:r>
+      <w:r>
+        <w:t>iera bibliotekę edytora dokumentu w technologii WPF.</w:t>
+      </w:r>
+    </w:p>
+    <w:p>
+      <w:pPr>
+        <w:pStyle w:val="NormalIndent"/>
+        <w:numPr>
+          <w:ilvl w:val="0"/>
+          <w:numId w:val="52"/>
+        </w:numPr>
+        <w:ind w:left="1068"/>
+        <w:rPr>
+          <w:rStyle w:val="NazwaProgramowa"/>
+        </w:rPr>
+      </w:pPr>
+      <w:r>
+        <w:rPr>
+          <w:rStyle w:val="NazwaProgramowa"/>
+        </w:rPr>
+        <w:t>DocxEx</w:t>
+      </w:r>
+      <w:r>
+        <w:t xml:space="preserve"> – zawiera bibliotekę definiującą model sekcji dokumentu.</w:t>
+      </w:r>
+    </w:p>
+    <w:p>
+      <w:pPr>
+        <w:pStyle w:val="NormalIndent"/>
+        <w:numPr>
+          <w:ilvl w:val="0"/>
+          <w:numId w:val="52"/>
+        </w:numPr>
+        <w:ind w:left="1068"/>
+        <w:rPr>
+          <w:rStyle w:val="NazwaProgramowa"/>
+        </w:rPr>
+      </w:pPr>
+      <w:r>
+        <w:rPr>
+          <w:rStyle w:val="NazwaProgramowa"/>
+        </w:rPr>
+        <w:t>DocxEx.Test</w:t>
+      </w:r>
+      <w:r>
+        <w:t xml:space="preserve"> – zawiera program do testowania projektu </w:t>
+      </w:r>
+      <w:r>
+        <w:rPr>
+          <w:rStyle w:val="NazwaProgramowa"/>
+        </w:rPr>
+        <w:t>DocxEx</w:t>
+      </w:r>
+      <w:r>
+        <w:t>.</w:t>
+      </w:r>
+    </w:p>
+    <w:p>
+      <w:pPr>
+        <w:pStyle w:val="NormalIndent"/>
+        <w:numPr>
+          <w:ilvl w:val="0"/>
+          <w:numId w:val="52"/>
+        </w:numPr>
+        <w:ind w:left="1068"/>
+        <w:rPr>
+          <w:rStyle w:val="NazwaProgramowa"/>
+        </w:rPr>
+      </w:pPr>
+      <w:r>
+        <w:rPr>
+          <w:rStyle w:val="NazwaProgramowa"/>
+        </w:rPr>
+        <w:lastRenderedPageBreak/>
+        <w:t>ExtractReferenceDocumentation</w:t>
+      </w:r>
+      <w:r>
+        <w:t xml:space="preserve"> – zawiera program do ekstrahowania informacji z plików dokumentacyjnych OpenXml.</w:t>
+      </w:r>
+    </w:p>
+    <w:p>
+      <w:pPr>
+        <w:pStyle w:val="NormalIndent"/>
+        <w:numPr>
+          <w:ilvl w:val="0"/>
+          <w:numId w:val="52"/>
+        </w:numPr>
+        <w:ind w:left="1068"/>
+        <w:rPr>
+          <w:rStyle w:val="NazwaProgramowa"/>
+        </w:rPr>
+      </w:pPr>
+      <w:r>
+        <w:rPr>
+          <w:rStyle w:val="NazwaProgramowa"/>
+        </w:rPr>
+        <w:t>ModelDoc</w:t>
+      </w:r>
+      <w:r>
+        <w:t xml:space="preserve"> – </w:t>
+      </w:r>
+      <w:r>
+        <w:t xml:space="preserve">biblioteka rozwiązania </w:t>
+      </w:r>
+      <w:r>
+        <w:rPr>
+          <w:rStyle w:val="NazwaProgramowa"/>
+        </w:rPr>
+        <w:t>ModelDocumentation</w:t>
+      </w:r>
+      <w:r>
+        <w:t>.</w:t>
+      </w:r>
+      <w:r>
+        <w:t xml:space="preserve"> </w:t>
+      </w:r>
+    </w:p>
+    <w:p>
+      <w:pPr>
+        <w:pStyle w:val="NormalIndent"/>
+        <w:numPr>
+          <w:ilvl w:val="0"/>
+          <w:numId w:val="52"/>
+        </w:numPr>
+        <w:ind w:left="1068"/>
+        <w:rPr>
+          <w:rStyle w:val="NazwaProgramowa"/>
+        </w:rPr>
+      </w:pPr>
+      <w:r>
+        <w:rPr>
+          <w:rStyle w:val="NazwaProgramowa"/>
+        </w:rPr>
+        <w:t>ModelDocApp</w:t>
+      </w:r>
+      <w:r>
+        <w:t xml:space="preserve"> – aplikacja rozwiązania </w:t>
+      </w:r>
+      <w:r>
+        <w:rPr>
+          <w:rStyle w:val="NazwaProgramowa"/>
+        </w:rPr>
+        <w:t>ModelDocumentation</w:t>
+      </w:r>
+      <w:r>
+        <w:t>.</w:t>
+      </w:r>
+    </w:p>
+    <w:p>
+      <w:pPr>
+        <w:pStyle w:val="NormalIndent"/>
+        <w:numPr>
+          <w:ilvl w:val="0"/>
+          <w:numId w:val="52"/>
+        </w:numPr>
+        <w:ind w:left="1068"/>
+        <w:rPr>
+          <w:rStyle w:val="NazwaProgramowa"/>
+        </w:rPr>
+      </w:pPr>
+      <w:r>
+        <w:rPr>
+          <w:rStyle w:val="NazwaProgramowa"/>
+        </w:rPr>
+        <w:t>ModelDocumentation</w:t>
+      </w:r>
+      <w:r>
+        <w:t xml:space="preserve"> – projekt główny rozwiązania do </w:t>
+      </w:r>
+      <w:r>
+        <w:t>analizowania schematu OpenXml.</w:t>
+      </w:r>
+    </w:p>
+    <w:p>
+      <w:pPr>
+        <w:pStyle w:val="NormalIndent"/>
+        <w:numPr>
+          <w:ilvl w:val="0"/>
+          <w:numId w:val="52"/>
+        </w:numPr>
+        <w:ind w:left="1068"/>
+        <w:rPr>
+          <w:rStyle w:val="NazwaProgramowa"/>
+        </w:rPr>
+      </w:pPr>
+      <w:r>
+        <w:rPr>
+          <w:rStyle w:val="NazwaProgramowa"/>
+        </w:rPr>
+        <w:t>ModelGen</w:t>
+      </w:r>
+      <w:r>
+        <w:t xml:space="preserve"> – zawiera bibliotekę do generowania modelu dokumentu z modelu OpenXml.</w:t>
+      </w:r>
+    </w:p>
+    <w:p>
+      <w:pPr>
+        <w:pStyle w:val="NormalIndent"/>
+        <w:numPr>
+          <w:ilvl w:val="0"/>
+          <w:numId w:val="52"/>
+        </w:numPr>
+        <w:ind w:left="1068"/>
+        <w:rPr>
+          <w:rStyle w:val="NazwaProgramowa"/>
+        </w:rPr>
+      </w:pPr>
+      <w:r>
+        <w:rPr>
+          <w:rStyle w:val="NazwaProgramowa"/>
+        </w:rPr>
+        <w:t>ModelGenApp</w:t>
+      </w:r>
+      <w:r>
+        <w:rPr>
+          <w:rStyle w:val="NazwaProgramowa"/>
+        </w:rPr>
+        <w:t xml:space="preserve"> </w:t>
+      </w:r>
+      <w:r>
+        <w:t>– zawiera aplikację do generowania modelu dokumentu z modelu OpenXml.</w:t>
+      </w:r>
+    </w:p>
+    <w:p>
+      <w:pPr>
+        <w:pStyle w:val="NormalIndent"/>
+        <w:numPr>
+          <w:ilvl w:val="0"/>
+          <w:numId w:val="52"/>
+        </w:numPr>
+        <w:ind w:left="1068"/>
+        <w:rPr>
+          <w:rStyle w:val="NazwaProgramowa"/>
+        </w:rPr>
+      </w:pPr>
+      <w:r>
+        <w:rPr>
+          <w:rStyle w:val="NazwaProgramowa"/>
+        </w:rPr>
+        <w:t>ModelGenDataConfig</w:t>
+      </w:r>
+      <w:r>
+        <w:t xml:space="preserve"> – zawiera konfigurację danych dla generowania modelu dokumentu z modelu OpenXml.</w:t>
+      </w:r>
+    </w:p>
+    <w:p>
+      <w:pPr>
+        <w:pStyle w:val="NormalIndent"/>
+        <w:numPr>
+          <w:ilvl w:val="0"/>
+          <w:numId w:val="52"/>
+        </w:numPr>
+        <w:ind w:left="1068"/>
+        <w:rPr>
+          <w:rStyle w:val="NazwaProgramowa"/>
+        </w:rPr>
+      </w:pPr>
+      <w:r>
+        <w:rPr>
+          <w:rStyle w:val="NazwaProgramowa"/>
+        </w:rPr>
+        <w:t>ModelGenRun</w:t>
+      </w:r>
+      <w:r>
+        <w:rPr>
+          <w:rStyle w:val="NazwaProgramowa"/>
+        </w:rPr>
+        <w:t xml:space="preserve"> </w:t>
+      </w:r>
+      <w:r>
+        <w:t>– uruchamia program do generowania modelu dokumentu z modelu OpenXml.</w:t>
+      </w:r>
+    </w:p>
+    <w:p>
+      <w:pPr>
+        <w:pStyle w:val="NormalIndent"/>
+        <w:numPr>
+          <w:ilvl w:val="0"/>
+          <w:numId w:val="52"/>
+        </w:numPr>
+        <w:ind w:left="1068"/>
+        <w:rPr>
+          <w:rStyle w:val="NazwaProgramowa"/>
+        </w:rPr>
+      </w:pPr>
+      <w:r>
+        <w:rPr>
+          <w:rStyle w:val="NazwaProgramowa"/>
+        </w:rPr>
+        <w:t>ModelOpenXmlCmt</w:t>
+      </w:r>
+      <w:r>
+        <w:t xml:space="preserve"> – </w:t>
+      </w:r>
+      <w:r>
+        <w:t xml:space="preserve">reprezentuje komentarze dokumentacyjne do modelu OpenXml. Komentarze są pobierane z pliku XML (wygenerowanego przy kompilacji pakietu </w:t>
+      </w:r>
+      <w:r>
+        <w:rPr>
+          <w:rStyle w:val="NazwaProgramowa"/>
+        </w:rPr>
+        <w:t>DocumentFormat.OpenXml</w:t>
+      </w:r>
+      <w:r>
+        <w:t xml:space="preserve"> i zapisane w bazie danych MS Access</w:t>
+      </w:r>
+      <w:r>
+        <w:t>.</w:t>
+      </w:r>
+    </w:p>
+    <w:p>
+      <w:pPr>
+        <w:pStyle w:val="NormalIndent"/>
+        <w:numPr>
+          <w:ilvl w:val="0"/>
+          <w:numId w:val="52"/>
+        </w:numPr>
+        <w:ind w:left="1068"/>
+        <w:rPr>
+          <w:rStyle w:val="NazwaProgramowa"/>
+        </w:rPr>
+      </w:pPr>
+      <w:r>
+        <w:rPr>
+          <w:rStyle w:val="NazwaProgramowa"/>
+        </w:rPr>
+        <w:t>ModelOpenXmlCmtApp</w:t>
+      </w:r>
+      <w:r>
+        <w:t xml:space="preserve"> - aplikacja konsolowa do parsowania plików i zapisywania modelu w bazie danych.</w:t>
+      </w:r>
+    </w:p>
+    <w:p>
+      <w:pPr>
+        <w:pStyle w:val="NormalIndent"/>
+        <w:numPr>
+          <w:ilvl w:val="0"/>
+          <w:numId w:val="52"/>
+        </w:numPr>
+        <w:ind w:left="1068"/>
+        <w:rPr>
+          <w:rStyle w:val="NazwaProgramowa"/>
+        </w:rPr>
+      </w:pPr>
+      <w:r>
+        <w:rPr>
+          <w:rStyle w:val="NazwaProgramowa"/>
+        </w:rPr>
+        <w:t>ModelOpenXmlDoc</w:t>
+      </w:r>
+      <w:r>
+        <w:t xml:space="preserve"> </w:t>
+      </w:r>
+      <w:r>
+        <w:t xml:space="preserve">– </w:t>
+      </w:r>
+      <w:r>
+        <w:t>reprezentuje model obiektowy OpenXml pobrany z wybranych plików DOCX i zapisany w bazie danych MS Access</w:t>
+      </w:r>
+    </w:p>
+    <w:p>
+      <w:pPr>
+        <w:pStyle w:val="NormalIndent"/>
+        <w:numPr>
+          <w:ilvl w:val="0"/>
+          <w:numId w:val="52"/>
+        </w:numPr>
+        <w:ind w:left="1068"/>
+        <w:rPr>
+          <w:rStyle w:val="NazwaProgramowa"/>
+        </w:rPr>
+      </w:pPr>
+      <w:r>
+        <w:rPr>
+          <w:rStyle w:val="NazwaProgramowa"/>
+        </w:rPr>
+        <w:t>ModelOpenXmlDocApp</w:t>
+      </w:r>
+      <w:r>
+        <w:rPr>
+          <w:rStyle w:val="NazwaProgramowa"/>
+        </w:rPr>
+        <w:t xml:space="preserve"> </w:t>
+      </w:r>
+      <w:r>
+        <w:t>– aplikacj</w:t>
+      </w:r>
+      <w:r>
+        <w:t>a</w:t>
+      </w:r>
+      <w:r>
+        <w:t xml:space="preserve"> konsolow</w:t>
+      </w:r>
+      <w:r>
+        <w:t>a</w:t>
+      </w:r>
+      <w:r>
+        <w:t xml:space="preserve"> do parsowania plików i zapisywania modelu w bazie danych</w:t>
+      </w:r>
+    </w:p>
+    <w:p>
+      <w:pPr>
+        <w:pStyle w:val="NormalIndent"/>
+        <w:numPr>
+          <w:ilvl w:val="0"/>
+          <w:numId w:val="52"/>
+        </w:numPr>
+        <w:ind w:left="1068"/>
+        <w:rPr>
+          <w:rStyle w:val="NazwaProgramowa"/>
+        </w:rPr>
+      </w:pPr>
+      <w:r>
+        <w:rPr>
+          <w:rStyle w:val="NazwaProgramowa"/>
+        </w:rPr>
+        <w:t>ModelOpenXmlLib</w:t>
+      </w:r>
+      <w:r>
+        <w:t xml:space="preserve"> – </w:t>
+      </w:r>
+      <w:r>
+        <w:t>reprezentuje model obiektowy OpenXml pobrany z plików DLL i zapisany w bazie danych MS Access</w:t>
+      </w:r>
+    </w:p>
+    <w:p>
+      <w:pPr>
+        <w:pStyle w:val="NormalIndent"/>
+        <w:numPr>
+          <w:ilvl w:val="0"/>
+          <w:numId w:val="52"/>
+        </w:numPr>
+        <w:ind w:left="1068"/>
+        <w:rPr>
+          <w:rStyle w:val="NazwaProgramowa"/>
+        </w:rPr>
+      </w:pPr>
+      <w:r>
+        <w:rPr>
+          <w:rStyle w:val="NazwaProgramowa"/>
+        </w:rPr>
+        <w:t>ModelOpenXmlLibApp</w:t>
+      </w:r>
+      <w:r>
+        <w:rPr>
+          <w:rStyle w:val="NazwaProgramowa"/>
+        </w:rPr>
+        <w:t xml:space="preserve"> </w:t>
+      </w:r>
+      <w:r>
+        <w:t>– aplikacj</w:t>
+      </w:r>
+      <w:r>
+        <w:t>a</w:t>
+      </w:r>
+      <w:r>
+        <w:t xml:space="preserve"> konsolow</w:t>
+      </w:r>
+      <w:r>
+        <w:t>a</w:t>
+      </w:r>
+      <w:r>
+        <w:t xml:space="preserve"> do parsowania plików i zapisywania modelu w bazie danych</w:t>
+      </w:r>
+    </w:p>
+    <w:p>
+      <w:pPr>
+        <w:pStyle w:val="NormalIndent"/>
+        <w:numPr>
+          <w:ilvl w:val="0"/>
+          <w:numId w:val="52"/>
+        </w:numPr>
+        <w:ind w:left="1068"/>
+      </w:pPr>
+      <w:r>
+        <w:rPr>
+          <w:rStyle w:val="NazwaProgramowa"/>
+        </w:rPr>
+        <w:t>ModelXmlSchema</w:t>
+      </w:r>
+      <w:r>
+        <w:rPr>
+          <w:rStyle w:val="NazwaProgramowa"/>
+        </w:rPr>
+        <w:t xml:space="preserve"> </w:t>
+      </w:r>
+      <w:r>
+        <w:t>–</w:t>
+      </w:r>
+      <w:r>
+        <w:t xml:space="preserve"> </w:t>
+      </w:r>
+      <w:r>
+        <w:t>zawiera model schematu Xml.</w:t>
+      </w:r>
+    </w:p>
+    <w:p>
+      <w:pPr>
+        <w:pStyle w:val="NormalIndent"/>
+        <w:numPr>
+          <w:ilvl w:val="0"/>
+          <w:numId w:val="52"/>
+        </w:numPr>
+        <w:ind w:left="1068"/>
+        <w:rPr>
+          <w:rStyle w:val="NazwaProgramowa"/>
+        </w:rPr>
+      </w:pPr>
+      <w:r>
+        <w:rPr>
+          <w:rStyle w:val="NazwaProgramowa"/>
+        </w:rPr>
+        <w:t>ModelXmlSchemaApp</w:t>
+      </w:r>
+      <w:r>
+        <w:t xml:space="preserve"> – zawiera aplikację do modelu schematu Xml.</w:t>
+      </w:r>
+    </w:p>
+    <w:p>
+      <w:pPr>
+        <w:pStyle w:val="NormalIndent"/>
+        <w:numPr>
+          <w:ilvl w:val="0"/>
+          <w:numId w:val="52"/>
+        </w:numPr>
+        <w:ind w:left="1068"/>
+        <w:rPr>
+          <w:rStyle w:val="NazwaProgramowa"/>
+        </w:rPr>
+      </w:pPr>
+      <w:r>
+        <w:rPr>
+          <w:rStyle w:val="NazwaProgramowa"/>
+        </w:rPr>
+        <w:t>NamespaceMappings</w:t>
+      </w:r>
+      <w:r>
+        <w:t xml:space="preserve"> – zawiera dwukierunkowe odwzorowanie przestrzeni nazw OpenXml w kilkuliterowe skróty.</w:t>
+      </w:r>
+    </w:p>
+    <w:p>
+      <w:pPr>
+        <w:pStyle w:val="NormalIndent"/>
+        <w:numPr>
+          <w:ilvl w:val="0"/>
+          <w:numId w:val="52"/>
+        </w:numPr>
+        <w:ind w:left="1068"/>
+        <w:rPr>
+          <w:rStyle w:val="NazwaProgramowa"/>
+        </w:rPr>
+      </w:pPr>
+      <w:r>
+        <w:rPr>
+          <w:rStyle w:val="NazwaProgramowa"/>
+        </w:rPr>
+        <w:t>OpenXmlDatabase</w:t>
+      </w:r>
+      <w:r>
+        <w:t xml:space="preserve"> – zawiera bazę danych MS Access zawierającą model OpenXml.</w:t>
+      </w:r>
+    </w:p>
+    <w:p>
+      <w:pPr>
+        <w:pStyle w:val="NormalIndent"/>
+        <w:numPr>
+          <w:ilvl w:val="0"/>
+          <w:numId w:val="52"/>
+        </w:numPr>
+        <w:ind w:left="1068"/>
+        <w:rPr>
+          <w:rStyle w:val="NazwaProgramowa"/>
+        </w:rPr>
+      </w:pPr>
+      <w:r>
+        <w:rPr>
+          <w:rStyle w:val="NazwaProgramowa"/>
+        </w:rPr>
+        <w:t>ProcessSources</w:t>
+      </w:r>
+      <w:r>
+        <w:t xml:space="preserve"> – zawiera program do przetwarzania plików źródłowych w C#.</w:t>
+      </w:r>
+    </w:p>
+    <w:p>
+      <w:pPr>
+        <w:pStyle w:val="NormalIndent"/>
+        <w:numPr>
+          <w:ilvl w:val="0"/>
+          <w:numId w:val="52"/>
+        </w:numPr>
+        <w:ind w:left="1068"/>
+        <w:rPr>
+          <w:rStyle w:val="NazwaProgramowa"/>
+        </w:rPr>
+      </w:pPr>
+      <w:r>
+        <w:rPr>
+          <w:rStyle w:val="NazwaProgramowa"/>
+        </w:rPr>
+        <w:t>Samples</w:t>
+      </w:r>
+      <w:r>
+        <w:t xml:space="preserve"> – zawiera przykładowe dokumenty Docx.</w:t>
+      </w:r>
+    </w:p>
+    <w:p>
+      <w:pPr>
+        <w:pStyle w:val="NormalIndent"/>
+        <w:numPr>
+          <w:ilvl w:val="0"/>
+          <w:numId w:val="52"/>
+        </w:numPr>
+        <w:ind w:left="1068"/>
+        <w:rPr>
+          <w:rStyle w:val="NazwaProgramowa"/>
+        </w:rPr>
+      </w:pPr>
+      <w:r>
+        <w:rPr>
+          <w:rStyle w:val="NazwaProgramowa"/>
+        </w:rPr>
+        <w:t>ScanOpenXmlTypes</w:t>
+      </w:r>
+      <w:r>
+        <w:rPr>
+          <w:rStyle w:val="NazwaProgramowa"/>
+        </w:rPr>
+        <w:t xml:space="preserve"> </w:t>
+      </w:r>
+      <w:r>
+        <w:t>– zawiera program do skanowania typów OpenXml.</w:t>
+      </w:r>
+    </w:p>
+    <w:p>
+      <w:pPr>
+        <w:pStyle w:val="NormalIndent"/>
+        <w:numPr>
+          <w:ilvl w:val="0"/>
+          <w:numId w:val="52"/>
+        </w:numPr>
+        <w:ind w:left="1068"/>
+        <w:rPr>
+          <w:rStyle w:val="NazwaProgramowa"/>
+        </w:rPr>
+      </w:pPr>
+      <w:r>
+        <w:rPr>
+          <w:rStyle w:val="NazwaProgramowa"/>
+        </w:rPr>
+        <w:t>SplitPdf</w:t>
+      </w:r>
+      <w:r>
+        <w:t xml:space="preserve"> – zawiera program do dzielenia dużego pliku PDF.</w:t>
+      </w:r>
+    </w:p>
+    <w:p>
+      <w:pPr>
+        <w:pStyle w:val="NormalIndent"/>
+        <w:numPr>
+          <w:ilvl w:val="0"/>
+          <w:numId w:val="52"/>
+        </w:numPr>
+        <w:ind w:left="1068"/>
+        <w:rPr>
+          <w:rStyle w:val="NazwaProgramowa"/>
+        </w:rPr>
+      </w:pPr>
+      <w:r>
+        <w:rPr>
+          <w:rStyle w:val="NazwaProgramowa"/>
+        </w:rPr>
+        <w:t>TestTextProcessor</w:t>
+      </w:r>
+      <w:r>
+        <w:t xml:space="preserve"> – zawiera program testowy do procesora tekstu.</w:t>
+      </w:r>
+    </w:p>
+    <w:p>
+      <w:pPr>
+        <w:pStyle w:val="NormalIndent"/>
+        <w:numPr>
+          <w:ilvl w:val="0"/>
+          <w:numId w:val="52"/>
+        </w:numPr>
+        <w:ind w:left="1068"/>
+        <w:rPr>
+          <w:rStyle w:val="NazwaProgramowa"/>
+        </w:rPr>
+      </w:pPr>
+      <w:r>
+        <w:rPr>
+          <w:rStyle w:val="NazwaProgramowa"/>
+        </w:rPr>
+        <w:t>WordInteropModel</w:t>
+      </w:r>
+      <w:r>
+        <w:t xml:space="preserve"> – łączy moduły definiujące model dokumentu.</w:t>
+      </w:r>
+    </w:p>
+    <w:p>
+      <w:pPr>
+        <w:pStyle w:val="NormalIndent"/>
+        <w:ind w:left="0"/>
+        <w:rPr>
+          <w:rStyle w:val="NazwaProgramowa"/>
+        </w:rPr>
+      </w:pPr>
     </w:p>
     <w:sectPr>
       <w:footerReference w:type="default" r:id="rId12"/>
@@ -3798,7 +5327,7 @@
 </file>
 
 <file path=word/endnotes.xml><?xml version="1.0" encoding="utf-8"?>
-<w:endnotes xmlns:wpc="http://schemas.microsoft.com/office/word/2010/wordprocessingCanvas" xmlns:cx="http://schemas.microsoft.com/office/drawing/2014/chartex" xmlns:cx1="http://schemas.microsoft.com/office/drawing/2015/9/8/chartex" xmlns:cx2="http://schemas.microsoft.com/office/drawing/2015/10/21/chartex" xmlns:cx3="http://schemas.microsoft.com/office/drawing/2016/5/9/chartex" xmlns:cx4="http://schemas.microsoft.com/office/drawing/2016/5/10/chartex" xmlns:cx5="http://schemas.microsoft.com/office/drawing/2016/5/11/chartex" xmlns:cx6="http://schemas.microsoft.com/office/drawing/2016/5/12/chartex" xmlns:cx7="http://schemas.microsoft.com/office/drawing/2016/5/13/chartex" xmlns:cx8="http://schemas.microsoft.com/office/drawing/2016/5/14/chartex" xmlns:mc="http://schemas.openxmlformats.org/markup-compatibility/2006" xmlns:aink="http://schemas.microsoft.com/office/drawing/2016/ink" xmlns:am3d="http://schemas.microsoft.com/office/drawing/2017/model3d" xmlns:o="urn:schemas-microsoft-com:office:office" xmlns:oel="http://schemas.microsoft.com/office/2019/extlst" xmlns:r="http://schemas.openxmlformats.org/officeDocument/2006/relationships" xmlns:m="http://schemas.openxmlformats.org/officeDocument/2006/math" xmlns:v="urn:schemas-microsoft-com:vml" xmlns:wp14="http://schemas.microsoft.com/office/word/2010/wordprocessingDrawing" xmlns:wp="http://schemas.openxmlformats.org/drawingml/2006/wordprocessingDrawing" xmlns:w10="urn:schemas-microsoft-com:office:word" xmlns:w="http://schemas.openxmlformats.org/wordprocessingml/2006/main" xmlns:w14="http://schemas.microsoft.com/office/word/2010/wordml" xmlns:w15="http://schemas.microsoft.com/office/word/2012/wordml" xmlns:w16cex="http://schemas.microsoft.com/office/word/2018/wordml/cex" xmlns:w16cid="http://schemas.microsoft.com/office/word/2016/wordml/cid" xmlns:w16="http://schemas.microsoft.com/office/word/2018/wordml" xmlns:w16sdtdh="http://schemas.microsoft.com/office/word/2020/wordml/sdtdatahash" xmlns:w16se="http://schemas.microsoft.com/office/word/2015/wordml/symex" xmlns:wpg="http://schemas.microsoft.com/office/word/2010/wordprocessingGroup" xmlns:wpi="http://schemas.microsoft.com/office/word/2010/wordprocessingInk" xmlns:wne="http://schemas.microsoft.com/office/word/2006/wordml" xmlns:wps="http://schemas.microsoft.com/office/word/2010/wordprocessingShape" mc:Ignorable="w14 w15 w16se w16cid w16 w16cex w16sdtdh wp14">
+<w:endnotes xmlns:wpc="http://schemas.microsoft.com/office/word/2010/wordprocessingCanvas" xmlns:cx="http://schemas.microsoft.com/office/drawing/2014/chartex" xmlns:cx1="http://schemas.microsoft.com/office/drawing/2015/9/8/chartex" xmlns:cx2="http://schemas.microsoft.com/office/drawing/2015/10/21/chartex" xmlns:cx3="http://schemas.microsoft.com/office/drawing/2016/5/9/chartex" xmlns:cx4="http://schemas.microsoft.com/office/drawing/2016/5/10/chartex" xmlns:cx5="http://schemas.microsoft.com/office/drawing/2016/5/11/chartex" xmlns:cx6="http://schemas.microsoft.com/office/drawing/2016/5/12/chartex" xmlns:cx7="http://schemas.microsoft.com/office/drawing/2016/5/13/chartex" xmlns:cx8="http://schemas.microsoft.com/office/drawing/2016/5/14/chartex" xmlns:mc="http://schemas.openxmlformats.org/markup-compatibility/2006" xmlns:aink="http://schemas.microsoft.com/office/drawing/2016/ink" xmlns:am3d="http://schemas.microsoft.com/office/drawing/2017/model3d" xmlns:o="urn:schemas-microsoft-com:office:office" xmlns:oel="http://schemas.microsoft.com/office/2019/extlst" xmlns:r="http://schemas.openxmlformats.org/officeDocument/2006/relationships" xmlns:m="http://schemas.openxmlformats.org/officeDocument/2006/math" xmlns:v="urn:schemas-microsoft-com:vml" xmlns:wp14="http://schemas.microsoft.com/office/word/2010/wordprocessingDrawing" xmlns:wp="http://schemas.openxmlformats.org/drawingml/2006/wordprocessingDrawing" xmlns:w10="urn:schemas-microsoft-com:office:word" xmlns:w="http://schemas.openxmlformats.org/wordprocessingml/2006/main" xmlns:w14="http://schemas.microsoft.com/office/word/2010/wordml" xmlns:w15="http://schemas.microsoft.com/office/word/2012/wordml" xmlns:w16cex="http://schemas.microsoft.com/office/word/2018/wordml/cex" xmlns:w16cid="http://schemas.microsoft.com/office/word/2016/wordml/cid" xmlns:w16="http://schemas.microsoft.com/office/word/2018/wordml" xmlns:w16du="http://schemas.microsoft.com/office/word/2023/wordml/word16du" xmlns:w16sdtdh="http://schemas.microsoft.com/office/word/2020/wordml/sdtdatahash" xmlns:w16sdtfl="http://schemas.microsoft.com/office/word/2024/wordml/sdtformatlock" xmlns:w16se="http://schemas.microsoft.com/office/word/2015/wordml/symex" xmlns:wpg="http://schemas.microsoft.com/office/word/2010/wordprocessingGroup" xmlns:wpi="http://schemas.microsoft.com/office/word/2010/wordprocessingInk" xmlns:wne="http://schemas.microsoft.com/office/word/2006/wordml" xmlns:wps="http://schemas.microsoft.com/office/word/2010/wordprocessingShape" mc:Ignorable="w14 w15 w16se w16cid w16 w16cex w16sdtdh w16sdtfl w16du wp14">
   <w:endnote w:type="separator" w:id="-1">
     <w:p>
       <w:r>
@@ -3817,7 +5346,7 @@
 </file>
 
 <file path=word/footer1.xml><?xml version="1.0" encoding="utf-8"?>
-<w:ftr xmlns:wpc="http://schemas.microsoft.com/office/word/2010/wordprocessingCanvas" xmlns:cx="http://schemas.microsoft.com/office/drawing/2014/chartex" xmlns:cx1="http://schemas.microsoft.com/office/drawing/2015/9/8/chartex" xmlns:cx2="http://schemas.microsoft.com/office/drawing/2015/10/21/chartex" xmlns:cx3="http://schemas.microsoft.com/office/drawing/2016/5/9/chartex" xmlns:cx4="http://schemas.microsoft.com/office/drawing/2016/5/10/chartex" xmlns:cx5="http://schemas.microsoft.com/office/drawing/2016/5/11/chartex" xmlns:cx6="http://schemas.microsoft.com/office/drawing/2016/5/12/chartex" xmlns:cx7="http://schemas.microsoft.com/office/drawing/2016/5/13/chartex" xmlns:cx8="http://schemas.microsoft.com/office/drawing/2016/5/14/chartex" xmlns:mc="http://schemas.openxmlformats.org/markup-compatibility/2006" xmlns:aink="http://schemas.microsoft.com/office/drawing/2016/ink" xmlns:am3d="http://schemas.microsoft.com/office/drawing/2017/model3d" xmlns:o="urn:schemas-microsoft-com:office:office" xmlns:oel="http://schemas.microsoft.com/office/2019/extlst" xmlns:r="http://schemas.openxmlformats.org/officeDocument/2006/relationships" xmlns:m="http://schemas.openxmlformats.org/officeDocument/2006/math" xmlns:v="urn:schemas-microsoft-com:vml" xmlns:wp14="http://schemas.microsoft.com/office/word/2010/wordprocessingDrawing" xmlns:wp="http://schemas.openxmlformats.org/drawingml/2006/wordprocessingDrawing" xmlns:w10="urn:schemas-microsoft-com:office:word" xmlns:w="http://schemas.openxmlformats.org/wordprocessingml/2006/main" xmlns:w14="http://schemas.microsoft.com/office/word/2010/wordml" xmlns:w15="http://schemas.microsoft.com/office/word/2012/wordml" xmlns:w16cex="http://schemas.microsoft.com/office/word/2018/wordml/cex" xmlns:w16cid="http://schemas.microsoft.com/office/word/2016/wordml/cid" xmlns:w16="http://schemas.microsoft.com/office/word/2018/wordml" xmlns:w16sdtdh="http://schemas.microsoft.com/office/word/2020/wordml/sdtdatahash" xmlns:w16se="http://schemas.microsoft.com/office/word/2015/wordml/symex" xmlns:wpg="http://schemas.microsoft.com/office/word/2010/wordprocessingGroup" xmlns:wpi="http://schemas.microsoft.com/office/word/2010/wordprocessingInk" xmlns:wne="http://schemas.microsoft.com/office/word/2006/wordml" xmlns:wps="http://schemas.microsoft.com/office/word/2010/wordprocessingShape" mc:Ignorable="w14 w15 w16se w16cid w16 w16cex w16sdtdh wp14">
+<w:ftr xmlns:wpc="http://schemas.microsoft.com/office/word/2010/wordprocessingCanvas" xmlns:cx="http://schemas.microsoft.com/office/drawing/2014/chartex" xmlns:cx1="http://schemas.microsoft.com/office/drawing/2015/9/8/chartex" xmlns:cx2="http://schemas.microsoft.com/office/drawing/2015/10/21/chartex" xmlns:cx3="http://schemas.microsoft.com/office/drawing/2016/5/9/chartex" xmlns:cx4="http://schemas.microsoft.com/office/drawing/2016/5/10/chartex" xmlns:cx5="http://schemas.microsoft.com/office/drawing/2016/5/11/chartex" xmlns:cx6="http://schemas.microsoft.com/office/drawing/2016/5/12/chartex" xmlns:cx7="http://schemas.microsoft.com/office/drawing/2016/5/13/chartex" xmlns:cx8="http://schemas.microsoft.com/office/drawing/2016/5/14/chartex" xmlns:mc="http://schemas.openxmlformats.org/markup-compatibility/2006" xmlns:aink="http://schemas.microsoft.com/office/drawing/2016/ink" xmlns:am3d="http://schemas.microsoft.com/office/drawing/2017/model3d" xmlns:o="urn:schemas-microsoft-com:office:office" xmlns:oel="http://schemas.microsoft.com/office/2019/extlst" xmlns:r="http://schemas.openxmlformats.org/officeDocument/2006/relationships" xmlns:m="http://schemas.openxmlformats.org/officeDocument/2006/math" xmlns:v="urn:schemas-microsoft-com:vml" xmlns:wp14="http://schemas.microsoft.com/office/word/2010/wordprocessingDrawing" xmlns:wp="http://schemas.openxmlformats.org/drawingml/2006/wordprocessingDrawing" xmlns:w10="urn:schemas-microsoft-com:office:word" xmlns:w="http://schemas.openxmlformats.org/wordprocessingml/2006/main" xmlns:w14="http://schemas.microsoft.com/office/word/2010/wordml" xmlns:w15="http://schemas.microsoft.com/office/word/2012/wordml" xmlns:w16cex="http://schemas.microsoft.com/office/word/2018/wordml/cex" xmlns:w16cid="http://schemas.microsoft.com/office/word/2016/wordml/cid" xmlns:w16="http://schemas.microsoft.com/office/word/2018/wordml" xmlns:w16du="http://schemas.microsoft.com/office/word/2023/wordml/word16du" xmlns:w16sdtdh="http://schemas.microsoft.com/office/word/2020/wordml/sdtdatahash" xmlns:w16sdtfl="http://schemas.microsoft.com/office/word/2024/wordml/sdtformatlock" xmlns:w16se="http://schemas.microsoft.com/office/word/2015/wordml/symex" xmlns:wpg="http://schemas.microsoft.com/office/word/2010/wordprocessingGroup" xmlns:wpi="http://schemas.microsoft.com/office/word/2010/wordprocessingInk" xmlns:wne="http://schemas.microsoft.com/office/word/2006/wordml" xmlns:wps="http://schemas.microsoft.com/office/word/2010/wordprocessingShape" mc:Ignorable="w14 w15 w16se w16cid w16 w16cex w16sdtdh w16sdtfl w16du wp14">
   <w:sdt>
     <w:sdtPr>
       <w:id w:val="1288932039"/>
@@ -3830,7 +5359,7 @@
     <w:sdtContent>
       <w:p>
         <w:pPr>
-          <w:pStyle w:val="Stopka"/>
+          <w:pStyle w:val="Footer"/>
           <w:jc w:val="right"/>
         </w:pPr>
         <w:r>
@@ -3853,14 +5382,14 @@
   </w:sdt>
   <w:p>
     <w:pPr>
-      <w:pStyle w:val="Stopka"/>
+      <w:pStyle w:val="Footer"/>
     </w:pPr>
   </w:p>
 </w:ftr>
 </file>
 
 <file path=word/footnotes.xml><?xml version="1.0" encoding="utf-8"?>
-<w:footnotes xmlns:wpc="http://schemas.microsoft.com/office/word/2010/wordprocessingCanvas" xmlns:cx="http://schemas.microsoft.com/office/drawing/2014/chartex" xmlns:cx1="http://schemas.microsoft.com/office/drawing/2015/9/8/chartex" xmlns:cx2="http://schemas.microsoft.com/office/drawing/2015/10/21/chartex" xmlns:cx3="http://schemas.microsoft.com/office/drawing/2016/5/9/chartex" xmlns:cx4="http://schemas.microsoft.com/office/drawing/2016/5/10/chartex" xmlns:cx5="http://schemas.microsoft.com/office/drawing/2016/5/11/chartex" xmlns:cx6="http://schemas.microsoft.com/office/drawing/2016/5/12/chartex" xmlns:cx7="http://schemas.microsoft.com/office/drawing/2016/5/13/chartex" xmlns:cx8="http://schemas.microsoft.com/office/drawing/2016/5/14/chartex" xmlns:mc="http://schemas.openxmlformats.org/markup-compatibility/2006" xmlns:aink="http://schemas.microsoft.com/office/drawing/2016/ink" xmlns:am3d="http://schemas.microsoft.com/office/drawing/2017/model3d" xmlns:o="urn:schemas-microsoft-com:office:office" xmlns:oel="http://schemas.microsoft.com/office/2019/extlst" xmlns:r="http://schemas.openxmlformats.org/officeDocument/2006/relationships" xmlns:m="http://schemas.openxmlformats.org/officeDocument/2006/math" xmlns:v="urn:schemas-microsoft-com:vml" xmlns:wp14="http://schemas.microsoft.com/office/word/2010/wordprocessingDrawing" xmlns:wp="http://schemas.openxmlformats.org/drawingml/2006/wordprocessingDrawing" xmlns:w10="urn:schemas-microsoft-com:office:word" xmlns:w="http://schemas.openxmlformats.org/wordprocessingml/2006/main" xmlns:w14="http://schemas.microsoft.com/office/word/2010/wordml" xmlns:w15="http://schemas.microsoft.com/office/word/2012/wordml" xmlns:w16cex="http://schemas.microsoft.com/office/word/2018/wordml/cex" xmlns:w16cid="http://schemas.microsoft.com/office/word/2016/wordml/cid" xmlns:w16="http://schemas.microsoft.com/office/word/2018/wordml" xmlns:w16sdtdh="http://schemas.microsoft.com/office/word/2020/wordml/sdtdatahash" xmlns:w16se="http://schemas.microsoft.com/office/word/2015/wordml/symex" xmlns:wpg="http://schemas.microsoft.com/office/word/2010/wordprocessingGroup" xmlns:wpi="http://schemas.microsoft.com/office/word/2010/wordprocessingInk" xmlns:wne="http://schemas.microsoft.com/office/word/2006/wordml" xmlns:wps="http://schemas.microsoft.com/office/word/2010/wordprocessingShape" mc:Ignorable="w14 w15 w16se w16cid w16 w16cex w16sdtdh wp14">
+<w:footnotes xmlns:wpc="http://schemas.microsoft.com/office/word/2010/wordprocessingCanvas" xmlns:cx="http://schemas.microsoft.com/office/drawing/2014/chartex" xmlns:cx1="http://schemas.microsoft.com/office/drawing/2015/9/8/chartex" xmlns:cx2="http://schemas.microsoft.com/office/drawing/2015/10/21/chartex" xmlns:cx3="http://schemas.microsoft.com/office/drawing/2016/5/9/chartex" xmlns:cx4="http://schemas.microsoft.com/office/drawing/2016/5/10/chartex" xmlns:cx5="http://schemas.microsoft.com/office/drawing/2016/5/11/chartex" xmlns:cx6="http://schemas.microsoft.com/office/drawing/2016/5/12/chartex" xmlns:cx7="http://schemas.microsoft.com/office/drawing/2016/5/13/chartex" xmlns:cx8="http://schemas.microsoft.com/office/drawing/2016/5/14/chartex" xmlns:mc="http://schemas.openxmlformats.org/markup-compatibility/2006" xmlns:aink="http://schemas.microsoft.com/office/drawing/2016/ink" xmlns:am3d="http://schemas.microsoft.com/office/drawing/2017/model3d" xmlns:o="urn:schemas-microsoft-com:office:office" xmlns:oel="http://schemas.microsoft.com/office/2019/extlst" xmlns:r="http://schemas.openxmlformats.org/officeDocument/2006/relationships" xmlns:m="http://schemas.openxmlformats.org/officeDocument/2006/math" xmlns:v="urn:schemas-microsoft-com:vml" xmlns:wp14="http://schemas.microsoft.com/office/word/2010/wordprocessingDrawing" xmlns:wp="http://schemas.openxmlformats.org/drawingml/2006/wordprocessingDrawing" xmlns:w10="urn:schemas-microsoft-com:office:word" xmlns:w="http://schemas.openxmlformats.org/wordprocessingml/2006/main" xmlns:w14="http://schemas.microsoft.com/office/word/2010/wordml" xmlns:w15="http://schemas.microsoft.com/office/word/2012/wordml" xmlns:w16cex="http://schemas.microsoft.com/office/word/2018/wordml/cex" xmlns:w16cid="http://schemas.microsoft.com/office/word/2016/wordml/cid" xmlns:w16="http://schemas.microsoft.com/office/word/2018/wordml" xmlns:w16du="http://schemas.microsoft.com/office/word/2023/wordml/word16du" xmlns:w16sdtdh="http://schemas.microsoft.com/office/word/2020/wordml/sdtdatahash" xmlns:w16sdtfl="http://schemas.microsoft.com/office/word/2024/wordml/sdtformatlock" xmlns:w16se="http://schemas.microsoft.com/office/word/2015/wordml/symex" xmlns:wpg="http://schemas.microsoft.com/office/word/2010/wordprocessingGroup" xmlns:wpi="http://schemas.microsoft.com/office/word/2010/wordprocessingInk" xmlns:wne="http://schemas.microsoft.com/office/word/2006/wordml" xmlns:wps="http://schemas.microsoft.com/office/word/2010/wordprocessingShape" mc:Ignorable="w14 w15 w16se w16cid w16 w16cex w16sdtdh w16sdtfl w16du wp14">
   <w:footnote w:type="separator" w:id="-1">
     <w:p>
       <w:r>
@@ -3879,7 +5408,7 @@
 </file>
 
 <file path=word/numbering.xml><?xml version="1.0" encoding="utf-8"?>
-<w:numbering xmlns:wpc="http://schemas.microsoft.com/office/word/2010/wordprocessingCanvas" xmlns:cx="http://schemas.microsoft.com/office/drawing/2014/chartex" xmlns:cx1="http://schemas.microsoft.com/office/drawing/2015/9/8/chartex" xmlns:cx2="http://schemas.microsoft.com/office/drawing/2015/10/21/chartex" xmlns:cx3="http://schemas.microsoft.com/office/drawing/2016/5/9/chartex" xmlns:cx4="http://schemas.microsoft.com/office/drawing/2016/5/10/chartex" xmlns:cx5="http://schemas.microsoft.com/office/drawing/2016/5/11/chartex" xmlns:cx6="http://schemas.microsoft.com/office/drawing/2016/5/12/chartex" xmlns:cx7="http://schemas.microsoft.com/office/drawing/2016/5/13/chartex" xmlns:cx8="http://schemas.microsoft.com/office/drawing/2016/5/14/chartex" xmlns:mc="http://schemas.openxmlformats.org/markup-compatibility/2006" xmlns:aink="http://schemas.microsoft.com/office/drawing/2016/ink" xmlns:am3d="http://schemas.microsoft.com/office/drawing/2017/model3d" xmlns:o="urn:schemas-microsoft-com:office:office" xmlns:oel="http://schemas.microsoft.com/office/2019/extlst" xmlns:r="http://schemas.openxmlformats.org/officeDocument/2006/relationships" xmlns:m="http://schemas.openxmlformats.org/officeDocument/2006/math" xmlns:v="urn:schemas-microsoft-com:vml" xmlns:wp14="http://schemas.microsoft.com/office/word/2010/wordprocessingDrawing" xmlns:wp="http://schemas.openxmlformats.org/drawingml/2006/wordprocessingDrawing" xmlns:w10="urn:schemas-microsoft-com:office:word" xmlns:w="http://schemas.openxmlformats.org/wordprocessingml/2006/main" xmlns:w14="http://schemas.microsoft.com/office/word/2010/wordml" xmlns:w15="http://schemas.microsoft.com/office/word/2012/wordml" xmlns:w16cex="http://schemas.microsoft.com/office/word/2018/wordml/cex" xmlns:w16cid="http://schemas.microsoft.com/office/word/2016/wordml/cid" xmlns:w16="http://schemas.microsoft.com/office/word/2018/wordml" xmlns:w16sdtdh="http://schemas.microsoft.com/office/word/2020/wordml/sdtdatahash" xmlns:w16se="http://schemas.microsoft.com/office/word/2015/wordml/symex" xmlns:wpg="http://schemas.microsoft.com/office/word/2010/wordprocessingGroup" xmlns:wpi="http://schemas.microsoft.com/office/word/2010/wordprocessingInk" xmlns:wne="http://schemas.microsoft.com/office/word/2006/wordml" xmlns:wps="http://schemas.microsoft.com/office/word/2010/wordprocessingShape" mc:Ignorable="w14 w15 w16se w16cid w16 w16cex w16sdtdh wp14">
+<w:numbering xmlns:wpc="http://schemas.microsoft.com/office/word/2010/wordprocessingCanvas" xmlns:cx="http://schemas.microsoft.com/office/drawing/2014/chartex" xmlns:cx1="http://schemas.microsoft.com/office/drawing/2015/9/8/chartex" xmlns:cx2="http://schemas.microsoft.com/office/drawing/2015/10/21/chartex" xmlns:cx3="http://schemas.microsoft.com/office/drawing/2016/5/9/chartex" xmlns:cx4="http://schemas.microsoft.com/office/drawing/2016/5/10/chartex" xmlns:cx5="http://schemas.microsoft.com/office/drawing/2016/5/11/chartex" xmlns:cx6="http://schemas.microsoft.com/office/drawing/2016/5/12/chartex" xmlns:cx7="http://schemas.microsoft.com/office/drawing/2016/5/13/chartex" xmlns:cx8="http://schemas.microsoft.com/office/drawing/2016/5/14/chartex" xmlns:mc="http://schemas.openxmlformats.org/markup-compatibility/2006" xmlns:aink="http://schemas.microsoft.com/office/drawing/2016/ink" xmlns:am3d="http://schemas.microsoft.com/office/drawing/2017/model3d" xmlns:o="urn:schemas-microsoft-com:office:office" xmlns:oel="http://schemas.microsoft.com/office/2019/extlst" xmlns:r="http://schemas.openxmlformats.org/officeDocument/2006/relationships" xmlns:m="http://schemas.openxmlformats.org/officeDocument/2006/math" xmlns:v="urn:schemas-microsoft-com:vml" xmlns:wp14="http://schemas.microsoft.com/office/word/2010/wordprocessingDrawing" xmlns:wp="http://schemas.openxmlformats.org/drawingml/2006/wordprocessingDrawing" xmlns:w10="urn:schemas-microsoft-com:office:word" xmlns:w="http://schemas.openxmlformats.org/wordprocessingml/2006/main" xmlns:w14="http://schemas.microsoft.com/office/word/2010/wordml" xmlns:w15="http://schemas.microsoft.com/office/word/2012/wordml" xmlns:w16cex="http://schemas.microsoft.com/office/word/2018/wordml/cex" xmlns:w16cid="http://schemas.microsoft.com/office/word/2016/wordml/cid" xmlns:w16="http://schemas.microsoft.com/office/word/2018/wordml" xmlns:w16du="http://schemas.microsoft.com/office/word/2023/wordml/word16du" xmlns:w16sdtdh="http://schemas.microsoft.com/office/word/2020/wordml/sdtdatahash" xmlns:w16sdtfl="http://schemas.microsoft.com/office/word/2024/wordml/sdtformatlock" xmlns:w16se="http://schemas.microsoft.com/office/word/2015/wordml/symex" xmlns:wpg="http://schemas.microsoft.com/office/word/2010/wordprocessingGroup" xmlns:wpi="http://schemas.microsoft.com/office/word/2010/wordprocessingInk" xmlns:wne="http://schemas.microsoft.com/office/word/2006/wordml" xmlns:wps="http://schemas.microsoft.com/office/word/2010/wordprocessingShape" mc:Ignorable="w14 w15 w16se w16cid w16 w16cex w16sdtdh w16sdtfl w16du wp14">
   <w:abstractNum w:abstractNumId="0" w15:restartNumberingAfterBreak="0">
     <w:nsid w:val="FFFFFF88"/>
     <w:multiLevelType w:val="singleLevel"/>
@@ -4238,7 +5767,7 @@
     <w:lvl w:ilvl="0" w:tplc="31828D3A">
       <w:start w:val="1"/>
       <w:numFmt w:val="bullet"/>
-      <w:pStyle w:val="Listapunktowana"/>
+      <w:pStyle w:val="ListBullet"/>
       <w:lvlText w:val=""/>
       <w:lvlJc w:val="left"/>
       <w:pPr>
@@ -4785,13 +6314,102 @@
     </w:lvl>
   </w:abstractNum>
   <w:abstractNum w:abstractNumId="12" w15:restartNumberingAfterBreak="0">
+    <w:nsid w:val="362326A4"/>
+    <w:multiLevelType w:val="hybridMultilevel"/>
+    <w:tmpl w:val="168EB880"/>
+    <w:lvl w:ilvl="0" w:tplc="6720BFDC">
+      <w:start w:val="1"/>
+      <w:numFmt w:val="decimal"/>
+      <w:lvlText w:val="%1."/>
+      <w:lvlJc w:val="left"/>
+      <w:pPr>
+        <w:ind w:left="1069" w:hanging="360"/>
+      </w:pPr>
+      <w:rPr>
+        <w:rFonts w:hint="default"/>
+      </w:rPr>
+    </w:lvl>
+    <w:lvl w:ilvl="1" w:tplc="04150019" w:tentative="1">
+      <w:start w:val="1"/>
+      <w:numFmt w:val="lowerLetter"/>
+      <w:lvlText w:val="%2."/>
+      <w:lvlJc w:val="left"/>
+      <w:pPr>
+        <w:ind w:left="1789" w:hanging="360"/>
+      </w:pPr>
+    </w:lvl>
+    <w:lvl w:ilvl="2" w:tplc="0415001B" w:tentative="1">
+      <w:start w:val="1"/>
+      <w:numFmt w:val="lowerRoman"/>
+      <w:lvlText w:val="%3."/>
+      <w:lvlJc w:val="right"/>
+      <w:pPr>
+        <w:ind w:left="2509" w:hanging="180"/>
+      </w:pPr>
+    </w:lvl>
+    <w:lvl w:ilvl="3" w:tplc="0415000F" w:tentative="1">
+      <w:start w:val="1"/>
+      <w:numFmt w:val="decimal"/>
+      <w:lvlText w:val="%4."/>
+      <w:lvlJc w:val="left"/>
+      <w:pPr>
+        <w:ind w:left="3229" w:hanging="360"/>
+      </w:pPr>
+    </w:lvl>
+    <w:lvl w:ilvl="4" w:tplc="04150019" w:tentative="1">
+      <w:start w:val="1"/>
+      <w:numFmt w:val="lowerLetter"/>
+      <w:lvlText w:val="%5."/>
+      <w:lvlJc w:val="left"/>
+      <w:pPr>
+        <w:ind w:left="3949" w:hanging="360"/>
+      </w:pPr>
+    </w:lvl>
+    <w:lvl w:ilvl="5" w:tplc="0415001B" w:tentative="1">
+      <w:start w:val="1"/>
+      <w:numFmt w:val="lowerRoman"/>
+      <w:lvlText w:val="%6."/>
+      <w:lvlJc w:val="right"/>
+      <w:pPr>
+        <w:ind w:left="4669" w:hanging="180"/>
+      </w:pPr>
+    </w:lvl>
+    <w:lvl w:ilvl="6" w:tplc="0415000F" w:tentative="1">
+      <w:start w:val="1"/>
+      <w:numFmt w:val="decimal"/>
+      <w:lvlText w:val="%7."/>
+      <w:lvlJc w:val="left"/>
+      <w:pPr>
+        <w:ind w:left="5389" w:hanging="360"/>
+      </w:pPr>
+    </w:lvl>
+    <w:lvl w:ilvl="7" w:tplc="04150019" w:tentative="1">
+      <w:start w:val="1"/>
+      <w:numFmt w:val="lowerLetter"/>
+      <w:lvlText w:val="%8."/>
+      <w:lvlJc w:val="left"/>
+      <w:pPr>
+        <w:ind w:left="6109" w:hanging="360"/>
+      </w:pPr>
+    </w:lvl>
+    <w:lvl w:ilvl="8" w:tplc="0415001B" w:tentative="1">
+      <w:start w:val="1"/>
+      <w:numFmt w:val="lowerRoman"/>
+      <w:lvlText w:val="%9."/>
+      <w:lvlJc w:val="right"/>
+      <w:pPr>
+        <w:ind w:left="6829" w:hanging="180"/>
+      </w:pPr>
+    </w:lvl>
+  </w:abstractNum>
+  <w:abstractNum w:abstractNumId="13" w15:restartNumberingAfterBreak="0">
     <w:nsid w:val="382804A5"/>
     <w:multiLevelType w:val="multilevel"/>
     <w:tmpl w:val="068440F2"/>
     <w:lvl w:ilvl="0">
       <w:start w:val="1"/>
       <w:numFmt w:val="ordinal"/>
-      <w:pStyle w:val="Listanumerowana"/>
+      <w:pStyle w:val="ListNumber"/>
       <w:lvlText w:val="%1"/>
       <w:lvlJc w:val="right"/>
       <w:pPr>
@@ -4877,7 +6495,7 @@
       </w:pPr>
     </w:lvl>
   </w:abstractNum>
-  <w:abstractNum w:abstractNumId="13" w15:restartNumberingAfterBreak="0">
+  <w:abstractNum w:abstractNumId="14" w15:restartNumberingAfterBreak="0">
     <w:nsid w:val="444A08F4"/>
     <w:multiLevelType w:val="multilevel"/>
     <w:tmpl w:val="0415001D"/>
@@ -4963,14 +6581,14 @@
       </w:pPr>
     </w:lvl>
   </w:abstractNum>
-  <w:abstractNum w:abstractNumId="14" w15:restartNumberingAfterBreak="0">
+  <w:abstractNum w:abstractNumId="15" w15:restartNumberingAfterBreak="0">
     <w:nsid w:val="46B304F4"/>
     <w:multiLevelType w:val="multilevel"/>
     <w:tmpl w:val="5764F8EC"/>
     <w:lvl w:ilvl="0">
       <w:start w:val="1"/>
       <w:numFmt w:val="decimal"/>
-      <w:pStyle w:val="Nagwek1"/>
+      <w:pStyle w:val="Heading1"/>
       <w:lvlText w:val="%1."/>
       <w:lvlJc w:val="left"/>
       <w:pPr>
@@ -4983,7 +6601,7 @@
     <w:lvl w:ilvl="1">
       <w:start w:val="1"/>
       <w:numFmt w:val="decimal"/>
-      <w:pStyle w:val="Nagwek2"/>
+      <w:pStyle w:val="Heading2"/>
       <w:lvlText w:val="%1.%2."/>
       <w:lvlJc w:val="left"/>
       <w:pPr>
@@ -4996,7 +6614,7 @@
     <w:lvl w:ilvl="2">
       <w:start w:val="1"/>
       <w:numFmt w:val="decimal"/>
-      <w:pStyle w:val="Nagwek3"/>
+      <w:pStyle w:val="Heading3"/>
       <w:lvlText w:val="%1.%2.%3."/>
       <w:lvlJc w:val="left"/>
       <w:pPr>
@@ -5009,7 +6627,7 @@
     <w:lvl w:ilvl="3">
       <w:start w:val="1"/>
       <w:numFmt w:val="decimal"/>
-      <w:pStyle w:val="Nagwek4"/>
+      <w:pStyle w:val="Heading4"/>
       <w:lvlText w:val="%1.%2.%3.%4."/>
       <w:lvlJc w:val="left"/>
       <w:pPr>
@@ -5022,7 +6640,7 @@
     <w:lvl w:ilvl="4">
       <w:start w:val="1"/>
       <w:numFmt w:val="decimal"/>
-      <w:pStyle w:val="Nagwek5"/>
+      <w:pStyle w:val="Heading5"/>
       <w:lvlText w:val="%1.%2.%3.%4.%5."/>
       <w:lvlJc w:val="left"/>
       <w:pPr>
@@ -5035,7 +6653,7 @@
     <w:lvl w:ilvl="5">
       <w:start w:val="1"/>
       <w:numFmt w:val="decimal"/>
-      <w:pStyle w:val="Nagwek6"/>
+      <w:pStyle w:val="Heading6"/>
       <w:lvlText w:val="%1.%2.%3.%4.%5.%6."/>
       <w:lvlJc w:val="left"/>
       <w:pPr>
@@ -5048,7 +6666,7 @@
     <w:lvl w:ilvl="6">
       <w:start w:val="1"/>
       <w:numFmt w:val="decimal"/>
-      <w:pStyle w:val="Nagwek7"/>
+      <w:pStyle w:val="Heading7"/>
       <w:lvlText w:val="%1.%2.%3.%4.%5.%6.%7."/>
       <w:lvlJc w:val="left"/>
       <w:pPr>
@@ -5061,7 +6679,7 @@
     <w:lvl w:ilvl="7">
       <w:start w:val="1"/>
       <w:numFmt w:val="decimal"/>
-      <w:pStyle w:val="Nagwek8"/>
+      <w:pStyle w:val="Heading8"/>
       <w:lvlText w:val="%1.%2.%3.%4.%5.%6.%7.%8."/>
       <w:lvlJc w:val="left"/>
       <w:pPr>
@@ -5074,7 +6692,7 @@
     <w:lvl w:ilvl="8">
       <w:start w:val="1"/>
       <w:numFmt w:val="decimal"/>
-      <w:pStyle w:val="Nagwek9"/>
+      <w:pStyle w:val="Heading9"/>
       <w:lvlText w:val="%1.%2.%3.%4.%5.%6.%7.%8.%9."/>
       <w:lvlJc w:val="left"/>
       <w:pPr>
@@ -5085,7 +6703,7 @@
       </w:rPr>
     </w:lvl>
   </w:abstractNum>
-  <w:abstractNum w:abstractNumId="15" w15:restartNumberingAfterBreak="0">
+  <w:abstractNum w:abstractNumId="16" w15:restartNumberingAfterBreak="0">
     <w:nsid w:val="4D267A9F"/>
     <w:multiLevelType w:val="multilevel"/>
     <w:tmpl w:val="EE4EAAD4"/>
@@ -5177,7 +6795,7 @@
       </w:pPr>
     </w:lvl>
   </w:abstractNum>
-  <w:abstractNum w:abstractNumId="16" w15:restartNumberingAfterBreak="0">
+  <w:abstractNum w:abstractNumId="17" w15:restartNumberingAfterBreak="0">
     <w:nsid w:val="4DEA6171"/>
     <w:multiLevelType w:val="multilevel"/>
     <w:tmpl w:val="0415001D"/>
@@ -5263,7 +6881,7 @@
       </w:pPr>
     </w:lvl>
   </w:abstractNum>
-  <w:abstractNum w:abstractNumId="17" w15:restartNumberingAfterBreak="0">
+  <w:abstractNum w:abstractNumId="18" w15:restartNumberingAfterBreak="0">
     <w:nsid w:val="523D2906"/>
     <w:multiLevelType w:val="hybridMultilevel"/>
     <w:tmpl w:val="6368056A"/>
@@ -5403,7 +7021,7 @@
       </w:rPr>
     </w:lvl>
   </w:abstractNum>
-  <w:abstractNum w:abstractNumId="18" w15:restartNumberingAfterBreak="0">
+  <w:abstractNum w:abstractNumId="19" w15:restartNumberingAfterBreak="0">
     <w:nsid w:val="53890640"/>
     <w:multiLevelType w:val="multilevel"/>
     <w:tmpl w:val="0B82F128"/>
@@ -5549,14 +7167,100 @@
       </w:rPr>
     </w:lvl>
   </w:abstractNum>
-  <w:abstractNum w:abstractNumId="19" w15:restartNumberingAfterBreak="0">
+  <w:abstractNum w:abstractNumId="20" w15:restartNumberingAfterBreak="0">
+    <w:nsid w:val="5C2375B6"/>
+    <w:multiLevelType w:val="hybridMultilevel"/>
+    <w:tmpl w:val="3ED00D58"/>
+    <w:lvl w:ilvl="0" w:tplc="0415000F">
+      <w:start w:val="1"/>
+      <w:numFmt w:val="decimal"/>
+      <w:lvlText w:val="%1."/>
+      <w:lvlJc w:val="left"/>
+      <w:pPr>
+        <w:ind w:left="720" w:hanging="360"/>
+      </w:pPr>
+    </w:lvl>
+    <w:lvl w:ilvl="1" w:tplc="04150019" w:tentative="1">
+      <w:start w:val="1"/>
+      <w:numFmt w:val="lowerLetter"/>
+      <w:lvlText w:val="%2."/>
+      <w:lvlJc w:val="left"/>
+      <w:pPr>
+        <w:ind w:left="1440" w:hanging="360"/>
+      </w:pPr>
+    </w:lvl>
+    <w:lvl w:ilvl="2" w:tplc="0415001B" w:tentative="1">
+      <w:start w:val="1"/>
+      <w:numFmt w:val="lowerRoman"/>
+      <w:lvlText w:val="%3."/>
+      <w:lvlJc w:val="right"/>
+      <w:pPr>
+        <w:ind w:left="2160" w:hanging="180"/>
+      </w:pPr>
+    </w:lvl>
+    <w:lvl w:ilvl="3" w:tplc="0415000F" w:tentative="1">
+      <w:start w:val="1"/>
+      <w:numFmt w:val="decimal"/>
+      <w:lvlText w:val="%4."/>
+      <w:lvlJc w:val="left"/>
+      <w:pPr>
+        <w:ind w:left="2880" w:hanging="360"/>
+      </w:pPr>
+    </w:lvl>
+    <w:lvl w:ilvl="4" w:tplc="04150019" w:tentative="1">
+      <w:start w:val="1"/>
+      <w:numFmt w:val="lowerLetter"/>
+      <w:lvlText w:val="%5."/>
+      <w:lvlJc w:val="left"/>
+      <w:pPr>
+        <w:ind w:left="3600" w:hanging="360"/>
+      </w:pPr>
+    </w:lvl>
+    <w:lvl w:ilvl="5" w:tplc="0415001B" w:tentative="1">
+      <w:start w:val="1"/>
+      <w:numFmt w:val="lowerRoman"/>
+      <w:lvlText w:val="%6."/>
+      <w:lvlJc w:val="right"/>
+      <w:pPr>
+        <w:ind w:left="4320" w:hanging="180"/>
+      </w:pPr>
+    </w:lvl>
+    <w:lvl w:ilvl="6" w:tplc="0415000F" w:tentative="1">
+      <w:start w:val="1"/>
+      <w:numFmt w:val="decimal"/>
+      <w:lvlText w:val="%7."/>
+      <w:lvlJc w:val="left"/>
+      <w:pPr>
+        <w:ind w:left="5040" w:hanging="360"/>
+      </w:pPr>
+    </w:lvl>
+    <w:lvl w:ilvl="7" w:tplc="04150019" w:tentative="1">
+      <w:start w:val="1"/>
+      <w:numFmt w:val="lowerLetter"/>
+      <w:lvlText w:val="%8."/>
+      <w:lvlJc w:val="left"/>
+      <w:pPr>
+        <w:ind w:left="5760" w:hanging="360"/>
+      </w:pPr>
+    </w:lvl>
+    <w:lvl w:ilvl="8" w:tplc="0415001B" w:tentative="1">
+      <w:start w:val="1"/>
+      <w:numFmt w:val="lowerRoman"/>
+      <w:lvlText w:val="%9."/>
+      <w:lvlJc w:val="right"/>
+      <w:pPr>
+        <w:ind w:left="6480" w:hanging="180"/>
+      </w:pPr>
+    </w:lvl>
+  </w:abstractNum>
+  <w:abstractNum w:abstractNumId="21" w15:restartNumberingAfterBreak="0">
     <w:nsid w:val="6EE2116E"/>
     <w:multiLevelType w:val="hybridMultilevel"/>
     <w:tmpl w:val="2476306A"/>
     <w:lvl w:ilvl="0" w:tplc="C87E17C0">
       <w:start w:val="1"/>
       <w:numFmt w:val="decimal"/>
-      <w:pStyle w:val="Bibliografia"/>
+      <w:pStyle w:val="Bibliography"/>
       <w:lvlText w:val="[%1]"/>
       <w:lvlJc w:val="left"/>
       <w:pPr>
@@ -5666,7 +7370,93 @@
       </w:pPr>
     </w:lvl>
   </w:abstractNum>
-  <w:abstractNum w:abstractNumId="20" w15:restartNumberingAfterBreak="0">
+  <w:abstractNum w:abstractNumId="22" w15:restartNumberingAfterBreak="0">
+    <w:nsid w:val="73043C0B"/>
+    <w:multiLevelType w:val="hybridMultilevel"/>
+    <w:tmpl w:val="3ECC9C50"/>
+    <w:lvl w:ilvl="0" w:tplc="0415000F">
+      <w:start w:val="1"/>
+      <w:numFmt w:val="decimal"/>
+      <w:lvlText w:val="%1."/>
+      <w:lvlJc w:val="left"/>
+      <w:pPr>
+        <w:ind w:left="720" w:hanging="360"/>
+      </w:pPr>
+    </w:lvl>
+    <w:lvl w:ilvl="1" w:tplc="04150019" w:tentative="1">
+      <w:start w:val="1"/>
+      <w:numFmt w:val="lowerLetter"/>
+      <w:lvlText w:val="%2."/>
+      <w:lvlJc w:val="left"/>
+      <w:pPr>
+        <w:ind w:left="1440" w:hanging="360"/>
+      </w:pPr>
+    </w:lvl>
+    <w:lvl w:ilvl="2" w:tplc="0415001B" w:tentative="1">
+      <w:start w:val="1"/>
+      <w:numFmt w:val="lowerRoman"/>
+      <w:lvlText w:val="%3."/>
+      <w:lvlJc w:val="right"/>
+      <w:pPr>
+        <w:ind w:left="2160" w:hanging="180"/>
+      </w:pPr>
+    </w:lvl>
+    <w:lvl w:ilvl="3" w:tplc="0415000F" w:tentative="1">
+      <w:start w:val="1"/>
+      <w:numFmt w:val="decimal"/>
+      <w:lvlText w:val="%4."/>
+      <w:lvlJc w:val="left"/>
+      <w:pPr>
+        <w:ind w:left="2880" w:hanging="360"/>
+      </w:pPr>
+    </w:lvl>
+    <w:lvl w:ilvl="4" w:tplc="04150019" w:tentative="1">
+      <w:start w:val="1"/>
+      <w:numFmt w:val="lowerLetter"/>
+      <w:lvlText w:val="%5."/>
+      <w:lvlJc w:val="left"/>
+      <w:pPr>
+        <w:ind w:left="3600" w:hanging="360"/>
+      </w:pPr>
+    </w:lvl>
+    <w:lvl w:ilvl="5" w:tplc="0415001B" w:tentative="1">
+      <w:start w:val="1"/>
+      <w:numFmt w:val="lowerRoman"/>
+      <w:lvlText w:val="%6."/>
+      <w:lvlJc w:val="right"/>
+      <w:pPr>
+        <w:ind w:left="4320" w:hanging="180"/>
+      </w:pPr>
+    </w:lvl>
+    <w:lvl w:ilvl="6" w:tplc="0415000F" w:tentative="1">
+      <w:start w:val="1"/>
+      <w:numFmt w:val="decimal"/>
+      <w:lvlText w:val="%7."/>
+      <w:lvlJc w:val="left"/>
+      <w:pPr>
+        <w:ind w:left="5040" w:hanging="360"/>
+      </w:pPr>
+    </w:lvl>
+    <w:lvl w:ilvl="7" w:tplc="04150019" w:tentative="1">
+      <w:start w:val="1"/>
+      <w:numFmt w:val="lowerLetter"/>
+      <w:lvlText w:val="%8."/>
+      <w:lvlJc w:val="left"/>
+      <w:pPr>
+        <w:ind w:left="5760" w:hanging="360"/>
+      </w:pPr>
+    </w:lvl>
+    <w:lvl w:ilvl="8" w:tplc="0415001B" w:tentative="1">
+      <w:start w:val="1"/>
+      <w:numFmt w:val="lowerRoman"/>
+      <w:lvlText w:val="%9."/>
+      <w:lvlJc w:val="right"/>
+      <w:pPr>
+        <w:ind w:left="6480" w:hanging="180"/>
+      </w:pPr>
+    </w:lvl>
+  </w:abstractNum>
+  <w:abstractNum w:abstractNumId="23" w15:restartNumberingAfterBreak="0">
     <w:nsid w:val="7556480B"/>
     <w:multiLevelType w:val="hybridMultilevel"/>
     <w:tmpl w:val="25C2F682"/>
@@ -5752,7 +7542,7 @@
       </w:pPr>
     </w:lvl>
   </w:abstractNum>
-  <w:abstractNum w:abstractNumId="21" w15:restartNumberingAfterBreak="0">
+  <w:abstractNum w:abstractNumId="24" w15:restartNumberingAfterBreak="0">
     <w:nsid w:val="76C36ABB"/>
     <w:multiLevelType w:val="multilevel"/>
     <w:tmpl w:val="C59A5A4C"/>
@@ -5917,10 +7707,10 @@
     <w:abstractNumId w:val="4"/>
   </w:num>
   <w:num w:numId="6" w16cid:durableId="2030137660">
-    <w:abstractNumId w:val="18"/>
+    <w:abstractNumId w:val="19"/>
   </w:num>
   <w:num w:numId="7" w16cid:durableId="1207336055">
-    <w:abstractNumId w:val="19"/>
+    <w:abstractNumId w:val="21"/>
   </w:num>
   <w:num w:numId="8" w16cid:durableId="69161927">
     <w:abstractNumId w:val="6"/>
@@ -5929,25 +7719,25 @@
     <w:abstractNumId w:val="6"/>
   </w:num>
   <w:num w:numId="10" w16cid:durableId="2059544050">
-    <w:abstractNumId w:val="19"/>
+    <w:abstractNumId w:val="21"/>
   </w:num>
   <w:num w:numId="11" w16cid:durableId="1721517412">
     <w:abstractNumId w:val="6"/>
   </w:num>
   <w:num w:numId="12" w16cid:durableId="1321273531">
-    <w:abstractNumId w:val="19"/>
+    <w:abstractNumId w:val="21"/>
   </w:num>
   <w:num w:numId="13" w16cid:durableId="1227372468">
     <w:abstractNumId w:val="6"/>
   </w:num>
   <w:num w:numId="14" w16cid:durableId="679164998">
-    <w:abstractNumId w:val="19"/>
+    <w:abstractNumId w:val="21"/>
   </w:num>
   <w:num w:numId="15" w16cid:durableId="407844329">
-    <w:abstractNumId w:val="14"/>
+    <w:abstractNumId w:val="15"/>
   </w:num>
   <w:num w:numId="16" w16cid:durableId="1707214707">
-    <w:abstractNumId w:val="14"/>
+    <w:abstractNumId w:val="15"/>
   </w:num>
   <w:num w:numId="17" w16cid:durableId="37508748">
     <w:abstractNumId w:val="0"/>
@@ -5956,34 +7746,34 @@
     <w:abstractNumId w:val="6"/>
   </w:num>
   <w:num w:numId="19" w16cid:durableId="301083878">
+    <w:abstractNumId w:val="15"/>
+  </w:num>
+  <w:num w:numId="20" w16cid:durableId="777792372">
+    <w:abstractNumId w:val="15"/>
+  </w:num>
+  <w:num w:numId="21" w16cid:durableId="783768167">
+    <w:abstractNumId w:val="15"/>
+  </w:num>
+  <w:num w:numId="22" w16cid:durableId="2072461642">
+    <w:abstractNumId w:val="15"/>
+  </w:num>
+  <w:num w:numId="23" w16cid:durableId="1911235958">
+    <w:abstractNumId w:val="15"/>
+  </w:num>
+  <w:num w:numId="24" w16cid:durableId="1598322017">
+    <w:abstractNumId w:val="15"/>
+  </w:num>
+  <w:num w:numId="25" w16cid:durableId="1583562347">
+    <w:abstractNumId w:val="15"/>
+  </w:num>
+  <w:num w:numId="26" w16cid:durableId="1164593285">
+    <w:abstractNumId w:val="15"/>
+  </w:num>
+  <w:num w:numId="27" w16cid:durableId="1023290602">
     <w:abstractNumId w:val="14"/>
   </w:num>
-  <w:num w:numId="20" w16cid:durableId="777792372">
-    <w:abstractNumId w:val="14"/>
-  </w:num>
-  <w:num w:numId="21" w16cid:durableId="783768167">
-    <w:abstractNumId w:val="14"/>
-  </w:num>
-  <w:num w:numId="22" w16cid:durableId="2072461642">
-    <w:abstractNumId w:val="14"/>
-  </w:num>
-  <w:num w:numId="23" w16cid:durableId="1911235958">
-    <w:abstractNumId w:val="14"/>
-  </w:num>
-  <w:num w:numId="24" w16cid:durableId="1598322017">
-    <w:abstractNumId w:val="14"/>
-  </w:num>
-  <w:num w:numId="25" w16cid:durableId="1583562347">
-    <w:abstractNumId w:val="14"/>
-  </w:num>
-  <w:num w:numId="26" w16cid:durableId="1164593285">
-    <w:abstractNumId w:val="14"/>
-  </w:num>
-  <w:num w:numId="27" w16cid:durableId="1023290602">
-    <w:abstractNumId w:val="13"/>
-  </w:num>
   <w:num w:numId="28" w16cid:durableId="1492600551">
-    <w:abstractNumId w:val="16"/>
+    <w:abstractNumId w:val="17"/>
   </w:num>
   <w:num w:numId="29" w16cid:durableId="1933052455">
     <w:abstractNumId w:val="2"/>
@@ -6025,10 +7815,10 @@
     <w:abstractNumId w:val="0"/>
   </w:num>
   <w:num w:numId="33" w16cid:durableId="409277932">
-    <w:abstractNumId w:val="12"/>
+    <w:abstractNumId w:val="13"/>
   </w:num>
   <w:num w:numId="34" w16cid:durableId="69038919">
-    <w:abstractNumId w:val="15"/>
+    <w:abstractNumId w:val="16"/>
   </w:num>
   <w:num w:numId="35" w16cid:durableId="811748317">
     <w:abstractNumId w:val="11"/>
@@ -6043,7 +7833,7 @@
     <w:abstractNumId w:val="9"/>
   </w:num>
   <w:num w:numId="39" w16cid:durableId="10962160">
-    <w:abstractNumId w:val="17"/>
+    <w:abstractNumId w:val="18"/>
   </w:num>
   <w:num w:numId="40" w16cid:durableId="752775880">
     <w:abstractNumId w:val="6"/>
@@ -6058,10 +7848,10 @@
     <w:abstractNumId w:val="1"/>
   </w:num>
   <w:num w:numId="44" w16cid:durableId="771363730">
-    <w:abstractNumId w:val="20"/>
+    <w:abstractNumId w:val="23"/>
   </w:num>
   <w:num w:numId="45" w16cid:durableId="1384674586">
-    <w:abstractNumId w:val="21"/>
+    <w:abstractNumId w:val="24"/>
   </w:num>
   <w:num w:numId="46" w16cid:durableId="1348213998">
     <w:abstractNumId w:val="3"/>
@@ -6102,11 +7892,20 @@
   <w:num w:numId="49" w16cid:durableId="863978309">
     <w:abstractNumId w:val="1"/>
   </w:num>
+  <w:num w:numId="50" w16cid:durableId="1469545060">
+    <w:abstractNumId w:val="12"/>
+  </w:num>
+  <w:num w:numId="51" w16cid:durableId="442960869">
+    <w:abstractNumId w:val="22"/>
+  </w:num>
+  <w:num w:numId="52" w16cid:durableId="199704071">
+    <w:abstractNumId w:val="20"/>
+  </w:num>
 </w:numbering>
 </file>
 
 <file path=word/styles.xml><?xml version="1.0" encoding="utf-8"?>
-<w:styles xmlns:mc="http://schemas.openxmlformats.org/markup-compatibility/2006" xmlns:r="http://schemas.openxmlformats.org/officeDocument/2006/relationships" xmlns:w="http://schemas.openxmlformats.org/wordprocessingml/2006/main" xmlns:w14="http://schemas.microsoft.com/office/word/2010/wordml" xmlns:w15="http://schemas.microsoft.com/office/word/2012/wordml" xmlns:w16cex="http://schemas.microsoft.com/office/word/2018/wordml/cex" xmlns:w16cid="http://schemas.microsoft.com/office/word/2016/wordml/cid" xmlns:w16="http://schemas.microsoft.com/office/word/2018/wordml" xmlns:w16sdtdh="http://schemas.microsoft.com/office/word/2020/wordml/sdtdatahash" xmlns:w16se="http://schemas.microsoft.com/office/word/2015/wordml/symex" mc:Ignorable="w14 w15 w16se w16cid w16 w16cex w16sdtdh">
+<w:styles xmlns:mc="http://schemas.openxmlformats.org/markup-compatibility/2006" xmlns:r="http://schemas.openxmlformats.org/officeDocument/2006/relationships" xmlns:w="http://schemas.openxmlformats.org/wordprocessingml/2006/main" xmlns:w14="http://schemas.microsoft.com/office/word/2010/wordml" xmlns:w15="http://schemas.microsoft.com/office/word/2012/wordml" xmlns:w16cex="http://schemas.microsoft.com/office/word/2018/wordml/cex" xmlns:w16cid="http://schemas.microsoft.com/office/word/2016/wordml/cid" xmlns:w16="http://schemas.microsoft.com/office/word/2018/wordml" xmlns:w16du="http://schemas.microsoft.com/office/word/2023/wordml/word16du" xmlns:w16sdtdh="http://schemas.microsoft.com/office/word/2020/wordml/sdtdatahash" xmlns:w16sdtfl="http://schemas.microsoft.com/office/word/2024/wordml/sdtformatlock" xmlns:w16se="http://schemas.microsoft.com/office/word/2015/wordml/symex" mc:Ignorable="w14 w15 w16se w16cid w16 w16cex w16sdtdh w16sdtfl w16du">
   <w:docDefaults>
     <w:rPrDefault>
       <w:rPr>
@@ -6418,7 +8217,7 @@
     <w:lsdException w:name="Unresolved Mention" w:semiHidden="1" w:uiPriority="99" w:unhideWhenUsed="1"/>
     <w:lsdException w:name="Smart Link" w:semiHidden="1" w:uiPriority="99" w:unhideWhenUsed="1"/>
   </w:latentStyles>
-  <w:style w:type="paragraph" w:default="1" w:styleId="Normalny">
+  <w:style w:type="paragraph" w:default="1" w:styleId="Normal">
     <w:name w:val="Normal"/>
     <w:qFormat/>
     <w:rsid w:val="00082734"/>
@@ -6432,11 +8231,11 @@
       <w14:ligatures w14:val="none"/>
     </w:rPr>
   </w:style>
-  <w:style w:type="paragraph" w:styleId="Nagwek1">
+  <w:style w:type="paragraph" w:styleId="Heading1">
     <w:name w:val="heading 1"/>
-    <w:basedOn w:val="Normalny"/>
-    <w:next w:val="Normalny"/>
-    <w:link w:val="Nagwek1Znak"/>
+    <w:basedOn w:val="Normal"/>
+    <w:next w:val="Normal"/>
+    <w:link w:val="Heading1Char"/>
     <w:uiPriority w:val="9"/>
     <w:qFormat/>
     <w:rsid w:val="00DD242A"/>
@@ -6457,11 +8256,11 @@
       <w:szCs w:val="36"/>
     </w:rPr>
   </w:style>
-  <w:style w:type="paragraph" w:styleId="Nagwek2">
+  <w:style w:type="paragraph" w:styleId="Heading2">
     <w:name w:val="heading 2"/>
-    <w:basedOn w:val="Normalny"/>
-    <w:next w:val="Normalny"/>
-    <w:link w:val="Nagwek2Znak"/>
+    <w:basedOn w:val="Normal"/>
+    <w:next w:val="Normal"/>
+    <w:link w:val="Heading2Char"/>
     <w:uiPriority w:val="9"/>
     <w:qFormat/>
     <w:rsid w:val="00DC1529"/>
@@ -6482,11 +8281,11 @@
       <w:szCs w:val="32"/>
     </w:rPr>
   </w:style>
-  <w:style w:type="paragraph" w:styleId="Nagwek3">
+  <w:style w:type="paragraph" w:styleId="Heading3">
     <w:name w:val="heading 3"/>
-    <w:basedOn w:val="Nagwek2"/>
-    <w:next w:val="Normalny"/>
-    <w:link w:val="Nagwek3Znak"/>
+    <w:basedOn w:val="Heading2"/>
+    <w:next w:val="Normal"/>
+    <w:link w:val="Heading3Char"/>
     <w:qFormat/>
     <w:rsid w:val="0077487D"/>
     <w:pPr>
@@ -6500,11 +8299,11 @@
       <w:sz w:val="28"/>
     </w:rPr>
   </w:style>
-  <w:style w:type="paragraph" w:styleId="Nagwek4">
+  <w:style w:type="paragraph" w:styleId="Heading4">
     <w:name w:val="heading 4"/>
-    <w:basedOn w:val="Normalny"/>
-    <w:next w:val="Normalny"/>
-    <w:link w:val="Nagwek4Znak"/>
+    <w:basedOn w:val="Normal"/>
+    <w:next w:val="Normal"/>
+    <w:link w:val="Heading4Char"/>
     <w:qFormat/>
     <w:rsid w:val="00082734"/>
     <w:pPr>
@@ -6521,11 +8320,11 @@
       <w:b/>
     </w:rPr>
   </w:style>
-  <w:style w:type="paragraph" w:styleId="Nagwek5">
+  <w:style w:type="paragraph" w:styleId="Heading5">
     <w:name w:val="heading 5"/>
-    <w:basedOn w:val="Normalny"/>
-    <w:next w:val="Normalny"/>
-    <w:link w:val="Nagwek5Znak"/>
+    <w:basedOn w:val="Normal"/>
+    <w:next w:val="Normal"/>
+    <w:link w:val="Heading5Char"/>
     <w:qFormat/>
     <w:rsid w:val="00082734"/>
     <w:pPr>
@@ -6544,11 +8343,11 @@
       <w:sz w:val="22"/>
     </w:rPr>
   </w:style>
-  <w:style w:type="paragraph" w:styleId="Nagwek6">
+  <w:style w:type="paragraph" w:styleId="Heading6">
     <w:name w:val="heading 6"/>
-    <w:basedOn w:val="Normalny"/>
-    <w:next w:val="Normalny"/>
-    <w:link w:val="Nagwek6Znak"/>
+    <w:basedOn w:val="Normal"/>
+    <w:next w:val="Normal"/>
+    <w:link w:val="Heading6Char"/>
     <w:semiHidden/>
     <w:unhideWhenUsed/>
     <w:qFormat/>
@@ -6568,11 +8367,11 @@
       <w:color w:val="1F3763" w:themeColor="accent1" w:themeShade="7F"/>
     </w:rPr>
   </w:style>
-  <w:style w:type="paragraph" w:styleId="Nagwek7">
+  <w:style w:type="paragraph" w:styleId="Heading7">
     <w:name w:val="heading 7"/>
-    <w:basedOn w:val="Normalny"/>
-    <w:next w:val="Normalny"/>
-    <w:link w:val="Nagwek7Znak"/>
+    <w:basedOn w:val="Normal"/>
+    <w:next w:val="Normal"/>
+    <w:link w:val="Heading7Char"/>
     <w:semiHidden/>
     <w:unhideWhenUsed/>
     <w:qFormat/>
@@ -6594,11 +8393,11 @@
       <w:color w:val="1F3763" w:themeColor="accent1" w:themeShade="7F"/>
     </w:rPr>
   </w:style>
-  <w:style w:type="paragraph" w:styleId="Nagwek8">
+  <w:style w:type="paragraph" w:styleId="Heading8">
     <w:name w:val="heading 8"/>
-    <w:basedOn w:val="Normalny"/>
-    <w:next w:val="Normalny"/>
-    <w:link w:val="Nagwek8Znak"/>
+    <w:basedOn w:val="Normal"/>
+    <w:next w:val="Normal"/>
+    <w:link w:val="Heading8Char"/>
     <w:semiHidden/>
     <w:unhideWhenUsed/>
     <w:qFormat/>
@@ -6620,11 +8419,11 @@
       <w:szCs w:val="21"/>
     </w:rPr>
   </w:style>
-  <w:style w:type="paragraph" w:styleId="Nagwek9">
+  <w:style w:type="paragraph" w:styleId="Heading9">
     <w:name w:val="heading 9"/>
-    <w:basedOn w:val="Normalny"/>
-    <w:next w:val="Normalny"/>
-    <w:link w:val="Nagwek9Znak"/>
+    <w:basedOn w:val="Normal"/>
+    <w:next w:val="Normal"/>
+    <w:link w:val="Heading9Char"/>
     <w:semiHidden/>
     <w:unhideWhenUsed/>
     <w:qFormat/>
@@ -6648,13 +8447,12 @@
       <w:szCs w:val="21"/>
     </w:rPr>
   </w:style>
-  <w:style w:type="character" w:default="1" w:styleId="Domylnaczcionkaakapitu">
+  <w:style w:type="character" w:default="1" w:styleId="DefaultParagraphFont">
     <w:name w:val="Default Paragraph Font"/>
     <w:uiPriority w:val="1"/>
-    <w:semiHidden/>
     <w:unhideWhenUsed/>
   </w:style>
-  <w:style w:type="table" w:default="1" w:styleId="Standardowy">
+  <w:style w:type="table" w:default="1" w:styleId="TableNormal">
     <w:name w:val="Normal Table"/>
     <w:uiPriority w:val="99"/>
     <w:semiHidden/>
@@ -6669,15 +8467,15 @@
       </w:tblCellMar>
     </w:tblPr>
   </w:style>
-  <w:style w:type="numbering" w:default="1" w:styleId="Bezlisty">
+  <w:style w:type="numbering" w:default="1" w:styleId="NoList">
     <w:name w:val="No List"/>
     <w:uiPriority w:val="99"/>
     <w:semiHidden/>
     <w:unhideWhenUsed/>
   </w:style>
-  <w:style w:type="paragraph" w:styleId="Bibliografia">
+  <w:style w:type="paragraph" w:styleId="Bibliography">
     <w:name w:val="Bibliography"/>
-    <w:basedOn w:val="Normalny"/>
+    <w:basedOn w:val="Normal"/>
     <w:rsid w:val="00082734"/>
     <w:pPr>
       <w:numPr>
@@ -6692,9 +8490,9 @@
       <w:sz w:val="20"/>
     </w:rPr>
   </w:style>
-  <w:style w:type="paragraph" w:styleId="Wcicienormalne">
+  <w:style w:type="paragraph" w:styleId="NormalIndent">
     <w:name w:val="Normal Indent"/>
-    <w:basedOn w:val="Normalny"/>
+    <w:basedOn w:val="Normal"/>
     <w:rsid w:val="00082734"/>
     <w:pPr>
       <w:spacing w:before="120" w:after="120"/>
@@ -6702,9 +8500,9 @@
       <w:jc w:val="both"/>
     </w:pPr>
   </w:style>
-  <w:style w:type="paragraph" w:styleId="Listapunktowana">
+  <w:style w:type="paragraph" w:styleId="ListBullet">
     <w:name w:val="List Bullet"/>
-    <w:basedOn w:val="Normalny"/>
+    <w:basedOn w:val="Normal"/>
     <w:rsid w:val="00B92E2C"/>
     <w:pPr>
       <w:numPr>
@@ -6715,7 +8513,7 @@
   </w:style>
   <w:style w:type="character" w:customStyle="1" w:styleId="angielskawstawka">
     <w:name w:val="angielska wstawka"/>
-    <w:basedOn w:val="Domylnaczcionkaakapitu"/>
+    <w:basedOn w:val="DefaultParagraphFont"/>
     <w:rsid w:val="00082734"/>
     <w:rPr>
       <w:i/>
@@ -6725,7 +8523,7 @@
   </w:style>
   <w:style w:type="paragraph" w:customStyle="1" w:styleId="Figure">
     <w:name w:val="Figure"/>
-    <w:basedOn w:val="Normalny"/>
+    <w:basedOn w:val="Normal"/>
     <w:rsid w:val="00082734"/>
     <w:pPr>
       <w:keepNext/>
@@ -6736,8 +8534,8 @@
   </w:style>
   <w:style w:type="paragraph" w:customStyle="1" w:styleId="Intitle">
     <w:name w:val="Intitle"/>
-    <w:basedOn w:val="Normalny"/>
-    <w:next w:val="Normalny"/>
+    <w:basedOn w:val="Normal"/>
+    <w:next w:val="Normal"/>
     <w:link w:val="IntitleZnak"/>
     <w:rsid w:val="00082734"/>
     <w:pPr>
@@ -6754,7 +8552,7 @@
   </w:style>
   <w:style w:type="character" w:customStyle="1" w:styleId="keyword">
     <w:name w:val="keyword"/>
-    <w:basedOn w:val="Domylnaczcionkaakapitu"/>
+    <w:basedOn w:val="DefaultParagraphFont"/>
     <w:rsid w:val="00082734"/>
     <w:rPr>
       <w:b/>
@@ -6763,7 +8561,7 @@
   </w:style>
   <w:style w:type="character" w:customStyle="1" w:styleId="NazwaProgramowa">
     <w:name w:val="NazwaProgramowa"/>
-    <w:basedOn w:val="Domylnaczcionkaakapitu"/>
+    <w:basedOn w:val="DefaultParagraphFont"/>
     <w:rsid w:val="00082734"/>
     <w:rPr>
       <w:rFonts w:asciiTheme="minorHAnsi" w:hAnsiTheme="minorHAnsi"/>
@@ -6772,7 +8570,7 @@
   </w:style>
   <w:style w:type="paragraph" w:customStyle="1" w:styleId="source">
     <w:name w:val="source"/>
-    <w:basedOn w:val="Normalny"/>
+    <w:basedOn w:val="Normal"/>
     <w:rsid w:val="00082734"/>
     <w:pPr>
       <w:spacing w:before="60" w:after="60"/>
@@ -6785,7 +8583,7 @@
   </w:style>
   <w:style w:type="paragraph" w:customStyle="1" w:styleId="Standardowyakapit">
     <w:name w:val="Standardowy akapit"/>
-    <w:basedOn w:val="Normalny"/>
+    <w:basedOn w:val="Normal"/>
     <w:link w:val="StandardowyakapitZnak"/>
     <w:rsid w:val="00082734"/>
     <w:pPr>
@@ -6795,7 +8593,7 @@
   </w:style>
   <w:style w:type="character" w:customStyle="1" w:styleId="StandardowyakapitZnak">
     <w:name w:val="Standardowy akapit Znak"/>
-    <w:basedOn w:val="Domylnaczcionkaakapitu"/>
+    <w:basedOn w:val="DefaultParagraphFont"/>
     <w:link w:val="Standardowyakapit"/>
     <w:rsid w:val="00082734"/>
     <w:rPr>
@@ -6805,7 +8603,7 @@
   </w:style>
   <w:style w:type="character" w:customStyle="1" w:styleId="IntitleZnak">
     <w:name w:val="Intitle Znak"/>
-    <w:basedOn w:val="Domylnaczcionkaakapitu"/>
+    <w:basedOn w:val="DefaultParagraphFont"/>
     <w:link w:val="Intitle"/>
     <w:rsid w:val="00082734"/>
     <w:rPr>
@@ -6816,10 +8614,10 @@
       <w:szCs w:val="24"/>
     </w:rPr>
   </w:style>
-  <w:style w:type="paragraph" w:styleId="Tytu">
+  <w:style w:type="paragraph" w:styleId="Title">
     <w:name w:val="Title"/>
-    <w:basedOn w:val="Normalny"/>
-    <w:link w:val="TytuZnak"/>
+    <w:basedOn w:val="Normal"/>
+    <w:link w:val="TitleChar"/>
     <w:qFormat/>
     <w:rsid w:val="00082734"/>
     <w:pPr>
@@ -6837,7 +8635,7 @@
   </w:style>
   <w:style w:type="paragraph" w:customStyle="1" w:styleId="Autor">
     <w:name w:val="Autor"/>
-    <w:basedOn w:val="Tytu"/>
+    <w:basedOn w:val="Title"/>
     <w:qFormat/>
     <w:rsid w:val="00082734"/>
     <w:rPr>
@@ -6846,10 +8644,10 @@
       <w:szCs w:val="22"/>
     </w:rPr>
   </w:style>
-  <w:style w:type="character" w:customStyle="1" w:styleId="Nagwek2Znak">
-    <w:name w:val="Nagłówek 2 Znak"/>
-    <w:basedOn w:val="Domylnaczcionkaakapitu"/>
-    <w:link w:val="Nagwek2"/>
+  <w:style w:type="character" w:customStyle="1" w:styleId="Heading2Char">
+    <w:name w:val="Heading 2 Char"/>
+    <w:basedOn w:val="DefaultParagraphFont"/>
+    <w:link w:val="Heading2"/>
     <w:uiPriority w:val="9"/>
     <w:rsid w:val="00DC1529"/>
     <w:rPr>
@@ -6861,10 +8659,10 @@
       <w14:ligatures w14:val="none"/>
     </w:rPr>
   </w:style>
-  <w:style w:type="character" w:customStyle="1" w:styleId="Nagwek1Znak">
-    <w:name w:val="Nagłówek 1 Znak"/>
-    <w:basedOn w:val="Domylnaczcionkaakapitu"/>
-    <w:link w:val="Nagwek1"/>
+  <w:style w:type="character" w:customStyle="1" w:styleId="Heading1Char">
+    <w:name w:val="Heading 1 Char"/>
+    <w:basedOn w:val="DefaultParagraphFont"/>
+    <w:link w:val="Heading1"/>
     <w:uiPriority w:val="9"/>
     <w:rsid w:val="00DD242A"/>
     <w:rPr>
@@ -6878,7 +8676,7 @@
   </w:style>
   <w:style w:type="paragraph" w:customStyle="1" w:styleId="SourceCode">
     <w:name w:val="SourceCode"/>
-    <w:basedOn w:val="Normalny"/>
+    <w:basedOn w:val="Normal"/>
     <w:qFormat/>
     <w:rsid w:val="00826FA0"/>
     <w:pPr>
@@ -6892,7 +8690,7 @@
   </w:style>
   <w:style w:type="paragraph" w:customStyle="1" w:styleId="Abstrakt">
     <w:name w:val="Abstrakt"/>
-    <w:basedOn w:val="Wcicienormalne"/>
+    <w:basedOn w:val="NormalIndent"/>
     <w:qFormat/>
     <w:rsid w:val="00082734"/>
     <w:rPr>
@@ -6900,10 +8698,10 @@
       <w:lang w:val="pl"/>
     </w:rPr>
   </w:style>
-  <w:style w:type="paragraph" w:styleId="Legenda">
+  <w:style w:type="paragraph" w:styleId="Caption">
     <w:name w:val="caption"/>
-    <w:basedOn w:val="Normalny"/>
-    <w:next w:val="Normalny"/>
+    <w:basedOn w:val="Normal"/>
+    <w:next w:val="Normal"/>
     <w:uiPriority w:val="35"/>
     <w:unhideWhenUsed/>
     <w:qFormat/>
@@ -6921,11 +8719,11 @@
       <w:szCs w:val="18"/>
     </w:rPr>
   </w:style>
-  <w:style w:type="paragraph" w:styleId="Podtytu">
+  <w:style w:type="paragraph" w:styleId="Subtitle">
     <w:name w:val="Subtitle"/>
-    <w:basedOn w:val="Tytu"/>
-    <w:next w:val="Normalny"/>
-    <w:link w:val="PodtytuZnak"/>
+    <w:basedOn w:val="Title"/>
+    <w:next w:val="Normal"/>
+    <w:link w:val="SubtitleChar"/>
     <w:uiPriority w:val="11"/>
     <w:qFormat/>
     <w:rsid w:val="00082734"/>
@@ -6935,10 +8733,10 @@
       <w:lang w:val="pl"/>
     </w:rPr>
   </w:style>
-  <w:style w:type="character" w:customStyle="1" w:styleId="PodtytuZnak">
-    <w:name w:val="Podtytuł Znak"/>
-    <w:basedOn w:val="Domylnaczcionkaakapitu"/>
-    <w:link w:val="Podtytu"/>
+  <w:style w:type="character" w:customStyle="1" w:styleId="SubtitleChar">
+    <w:name w:val="Subtitle Char"/>
+    <w:basedOn w:val="DefaultParagraphFont"/>
+    <w:link w:val="Subtitle"/>
     <w:uiPriority w:val="11"/>
     <w:rsid w:val="00082734"/>
     <w:rPr>
@@ -6962,7 +8760,7 @@
   </w:style>
   <w:style w:type="paragraph" w:customStyle="1" w:styleId="Afiliation">
     <w:name w:val="Afiliation"/>
-    <w:basedOn w:val="Normalny"/>
+    <w:basedOn w:val="Normal"/>
     <w:qFormat/>
     <w:rsid w:val="00082734"/>
     <w:pPr>
@@ -6976,10 +8774,10 @@
       <w:szCs w:val="14"/>
     </w:rPr>
   </w:style>
-  <w:style w:type="character" w:customStyle="1" w:styleId="TytuZnak">
-    <w:name w:val="Tytuł Znak"/>
-    <w:basedOn w:val="Domylnaczcionkaakapitu"/>
-    <w:link w:val="Tytu"/>
+  <w:style w:type="character" w:customStyle="1" w:styleId="TitleChar">
+    <w:name w:val="Title Char"/>
+    <w:basedOn w:val="DefaultParagraphFont"/>
+    <w:link w:val="Title"/>
     <w:rsid w:val="00082734"/>
     <w:rPr>
       <w:rFonts w:ascii="Arial" w:hAnsi="Arial"/>
@@ -6989,10 +8787,10 @@
       <w:szCs w:val="40"/>
     </w:rPr>
   </w:style>
-  <w:style w:type="character" w:customStyle="1" w:styleId="Nagwek3Znak">
-    <w:name w:val="Nagłówek 3 Znak"/>
-    <w:basedOn w:val="Domylnaczcionkaakapitu"/>
-    <w:link w:val="Nagwek3"/>
+  <w:style w:type="character" w:customStyle="1" w:styleId="Heading3Char">
+    <w:name w:val="Heading 3 Char"/>
+    <w:basedOn w:val="DefaultParagraphFont"/>
+    <w:link w:val="Heading3"/>
     <w:rsid w:val="0077487D"/>
     <w:rPr>
       <w:rFonts w:ascii="Arial Narrow" w:hAnsi="Arial Narrow"/>
@@ -7003,10 +8801,10 @@
       <w14:ligatures w14:val="none"/>
     </w:rPr>
   </w:style>
-  <w:style w:type="character" w:customStyle="1" w:styleId="Nagwek4Znak">
-    <w:name w:val="Nagłówek 4 Znak"/>
-    <w:basedOn w:val="Domylnaczcionkaakapitu"/>
-    <w:link w:val="Nagwek4"/>
+  <w:style w:type="character" w:customStyle="1" w:styleId="Heading4Char">
+    <w:name w:val="Heading 4 Char"/>
+    <w:basedOn w:val="DefaultParagraphFont"/>
+    <w:link w:val="Heading4"/>
     <w:rsid w:val="00082734"/>
     <w:rPr>
       <w:rFonts w:ascii="Arial Narrow" w:hAnsi="Arial Narrow"/>
@@ -7014,10 +8812,10 @@
       <w:sz w:val="24"/>
     </w:rPr>
   </w:style>
-  <w:style w:type="character" w:customStyle="1" w:styleId="Nagwek5Znak">
-    <w:name w:val="Nagłówek 5 Znak"/>
-    <w:basedOn w:val="Domylnaczcionkaakapitu"/>
-    <w:link w:val="Nagwek5"/>
+  <w:style w:type="character" w:customStyle="1" w:styleId="Heading5Char">
+    <w:name w:val="Heading 5 Char"/>
+    <w:basedOn w:val="DefaultParagraphFont"/>
+    <w:link w:val="Heading5"/>
     <w:rsid w:val="00082734"/>
     <w:rPr>
       <w:rFonts w:ascii="Arial" w:hAnsi="Arial"/>
@@ -7025,9 +8823,9 @@
       <w:i/>
     </w:rPr>
   </w:style>
-  <w:style w:type="table" w:styleId="Tabela-Siatka">
+  <w:style w:type="table" w:styleId="TableGrid">
     <w:name w:val="Table Grid"/>
-    <w:basedOn w:val="Standardowy"/>
+    <w:basedOn w:val="TableNormal"/>
     <w:uiPriority w:val="39"/>
     <w:rsid w:val="00F70159"/>
     <w:pPr>
@@ -7084,7 +8882,7 @@
       </w:tcPr>
     </w:tblStylePr>
   </w:style>
-  <w:style w:type="table" w:customStyle="1" w:styleId="TableGrid">
+  <w:style w:type="table" w:customStyle="1" w:styleId="TableGrid0">
     <w:name w:val="TableGrid"/>
     <w:rsid w:val="00082734"/>
     <w:tblPr>
@@ -7098,7 +8896,7 @@
   </w:style>
   <w:style w:type="paragraph" w:customStyle="1" w:styleId="Bibtitle">
     <w:name w:val="Bibtitle"/>
-    <w:basedOn w:val="Nagwek1"/>
+    <w:basedOn w:val="Heading1"/>
     <w:qFormat/>
     <w:rsid w:val="00082734"/>
     <w:pPr>
@@ -7108,7 +8906,7 @@
   </w:style>
   <w:style w:type="table" w:customStyle="1" w:styleId="Standardowatabela">
     <w:name w:val="Standardowa tabela"/>
-    <w:basedOn w:val="Standardowy"/>
+    <w:basedOn w:val="TableNormal"/>
     <w:uiPriority w:val="99"/>
     <w:rsid w:val="00082734"/>
     <w:pPr>
@@ -7147,9 +8945,9 @@
       </w:tcPr>
     </w:tblStylePr>
   </w:style>
-  <w:style w:type="paragraph" w:styleId="Akapitzlist">
+  <w:style w:type="paragraph" w:styleId="ListParagraph">
     <w:name w:val="List Paragraph"/>
-    <w:basedOn w:val="Normalny"/>
+    <w:basedOn w:val="Normal"/>
     <w:uiPriority w:val="34"/>
     <w:qFormat/>
     <w:rsid w:val="00082734"/>
@@ -7160,7 +8958,7 @@
   </w:style>
   <w:style w:type="character" w:customStyle="1" w:styleId="Comment">
     <w:name w:val="Comment"/>
-    <w:basedOn w:val="Domylnaczcionkaakapitu"/>
+    <w:basedOn w:val="DefaultParagraphFont"/>
     <w:rsid w:val="00082734"/>
     <w:rPr>
       <w:rFonts w:ascii="Times New Roman" w:hAnsi="Times New Roman" w:cs="Times New Roman"/>
@@ -7189,12 +8987,12 @@
   </w:style>
   <w:style w:type="character" w:customStyle="1" w:styleId="elementname">
     <w:name w:val="elementname"/>
-    <w:basedOn w:val="Domylnaczcionkaakapitu"/>
+    <w:basedOn w:val="DefaultParagraphFont"/>
     <w:rsid w:val="00082734"/>
   </w:style>
-  <w:style w:type="character" w:styleId="Hipercze">
+  <w:style w:type="character" w:styleId="Hyperlink">
     <w:name w:val="Hyperlink"/>
-    <w:basedOn w:val="Domylnaczcionkaakapitu"/>
+    <w:basedOn w:val="DefaultParagraphFont"/>
     <w:uiPriority w:val="99"/>
     <w:rsid w:val="00082734"/>
     <w:rPr>
@@ -7202,9 +9000,9 @@
       <w:u w:val="single"/>
     </w:rPr>
   </w:style>
-  <w:style w:type="character" w:styleId="HTML-kod">
+  <w:style w:type="character" w:styleId="HTMLCode">
     <w:name w:val="HTML Code"/>
-    <w:basedOn w:val="Domylnaczcionkaakapitu"/>
+    <w:basedOn w:val="DefaultParagraphFont"/>
     <w:uiPriority w:val="99"/>
     <w:unhideWhenUsed/>
     <w:rsid w:val="00082734"/>
@@ -7214,10 +9012,10 @@
       <w:szCs w:val="20"/>
     </w:rPr>
   </w:style>
-  <w:style w:type="paragraph" w:styleId="HTML-wstpniesformatowany">
+  <w:style w:type="paragraph" w:styleId="HTMLPreformatted">
     <w:name w:val="HTML Preformatted"/>
-    <w:basedOn w:val="Normalny"/>
-    <w:link w:val="HTML-wstpniesformatowanyZnak"/>
+    <w:basedOn w:val="Normal"/>
+    <w:link w:val="HTMLPreformattedChar"/>
     <w:uiPriority w:val="99"/>
     <w:unhideWhenUsed/>
     <w:rsid w:val="00082734"/>
@@ -7247,10 +9045,10 @@
       <w:szCs w:val="20"/>
     </w:rPr>
   </w:style>
-  <w:style w:type="character" w:customStyle="1" w:styleId="HTML-wstpniesformatowanyZnak">
-    <w:name w:val="HTML - wstępnie sformatowany Znak"/>
-    <w:basedOn w:val="Domylnaczcionkaakapitu"/>
-    <w:link w:val="HTML-wstpniesformatowany"/>
+  <w:style w:type="character" w:customStyle="1" w:styleId="HTMLPreformattedChar">
+    <w:name w:val="HTML Preformatted Char"/>
+    <w:basedOn w:val="DefaultParagraphFont"/>
+    <w:link w:val="HTMLPreformatted"/>
     <w:uiPriority w:val="99"/>
     <w:rsid w:val="00082734"/>
     <w:rPr>
@@ -7259,9 +9057,9 @@
       <w:szCs w:val="20"/>
     </w:rPr>
   </w:style>
-  <w:style w:type="paragraph" w:styleId="Listanumerowana">
+  <w:style w:type="paragraph" w:styleId="ListNumber">
     <w:name w:val="List Number"/>
-    <w:basedOn w:val="Listapunktowana"/>
+    <w:basedOn w:val="ListBullet"/>
     <w:rsid w:val="00B92E2C"/>
     <w:pPr>
       <w:numPr>
@@ -7269,10 +9067,10 @@
       </w:numPr>
     </w:pPr>
   </w:style>
-  <w:style w:type="paragraph" w:styleId="Nagwek">
+  <w:style w:type="paragraph" w:styleId="Header">
     <w:name w:val="header"/>
-    <w:basedOn w:val="Normalny"/>
-    <w:link w:val="NagwekZnak"/>
+    <w:basedOn w:val="Normal"/>
+    <w:link w:val="HeaderChar"/>
     <w:rsid w:val="00082734"/>
     <w:pPr>
       <w:tabs>
@@ -7281,20 +9079,20 @@
       </w:tabs>
     </w:pPr>
   </w:style>
-  <w:style w:type="character" w:customStyle="1" w:styleId="NagwekZnak">
-    <w:name w:val="Nagłówek Znak"/>
-    <w:basedOn w:val="Domylnaczcionkaakapitu"/>
-    <w:link w:val="Nagwek"/>
+  <w:style w:type="character" w:customStyle="1" w:styleId="HeaderChar">
+    <w:name w:val="Header Char"/>
+    <w:basedOn w:val="DefaultParagraphFont"/>
+    <w:link w:val="Header"/>
     <w:rsid w:val="00082734"/>
     <w:rPr>
       <w:rFonts w:asciiTheme="majorBidi" w:hAnsiTheme="majorBidi"/>
       <w:sz w:val="24"/>
     </w:rPr>
   </w:style>
-  <w:style w:type="character" w:customStyle="1" w:styleId="Nagwek6Znak">
-    <w:name w:val="Nagłówek 6 Znak"/>
-    <w:basedOn w:val="Domylnaczcionkaakapitu"/>
-    <w:link w:val="Nagwek6"/>
+  <w:style w:type="character" w:customStyle="1" w:styleId="Heading6Char">
+    <w:name w:val="Heading 6 Char"/>
+    <w:basedOn w:val="DefaultParagraphFont"/>
+    <w:link w:val="Heading6"/>
     <w:semiHidden/>
     <w:rsid w:val="00082734"/>
     <w:rPr>
@@ -7303,10 +9101,10 @@
       <w:sz w:val="24"/>
     </w:rPr>
   </w:style>
-  <w:style w:type="character" w:customStyle="1" w:styleId="Nagwek7Znak">
-    <w:name w:val="Nagłówek 7 Znak"/>
-    <w:basedOn w:val="Domylnaczcionkaakapitu"/>
-    <w:link w:val="Nagwek7"/>
+  <w:style w:type="character" w:customStyle="1" w:styleId="Heading7Char">
+    <w:name w:val="Heading 7 Char"/>
+    <w:basedOn w:val="DefaultParagraphFont"/>
+    <w:link w:val="Heading7"/>
     <w:semiHidden/>
     <w:rsid w:val="00082734"/>
     <w:rPr>
@@ -7317,10 +9115,10 @@
       <w:sz w:val="24"/>
     </w:rPr>
   </w:style>
-  <w:style w:type="character" w:customStyle="1" w:styleId="Nagwek8Znak">
-    <w:name w:val="Nagłówek 8 Znak"/>
-    <w:basedOn w:val="Domylnaczcionkaakapitu"/>
-    <w:link w:val="Nagwek8"/>
+  <w:style w:type="character" w:customStyle="1" w:styleId="Heading8Char">
+    <w:name w:val="Heading 8 Char"/>
+    <w:basedOn w:val="DefaultParagraphFont"/>
+    <w:link w:val="Heading8"/>
     <w:semiHidden/>
     <w:rsid w:val="00082734"/>
     <w:rPr>
@@ -7330,10 +9128,10 @@
       <w:szCs w:val="21"/>
     </w:rPr>
   </w:style>
-  <w:style w:type="character" w:customStyle="1" w:styleId="Nagwek9Znak">
-    <w:name w:val="Nagłówek 9 Znak"/>
-    <w:basedOn w:val="Domylnaczcionkaakapitu"/>
-    <w:link w:val="Nagwek9"/>
+  <w:style w:type="character" w:customStyle="1" w:styleId="Heading9Char">
+    <w:name w:val="Heading 9 Char"/>
+    <w:basedOn w:val="DefaultParagraphFont"/>
+    <w:link w:val="Heading9"/>
     <w:semiHidden/>
     <w:rsid w:val="00082734"/>
     <w:rPr>
@@ -7345,9 +9143,9 @@
       <w:szCs w:val="21"/>
     </w:rPr>
   </w:style>
-  <w:style w:type="character" w:styleId="Nierozpoznanawzmianka">
+  <w:style w:type="character" w:styleId="UnresolvedMention">
     <w:name w:val="Unresolved Mention"/>
-    <w:basedOn w:val="Domylnaczcionkaakapitu"/>
+    <w:basedOn w:val="DefaultParagraphFont"/>
     <w:uiPriority w:val="99"/>
     <w:semiHidden/>
     <w:unhideWhenUsed/>
@@ -7357,9 +9155,9 @@
       <w:shd w:val="clear" w:color="auto" w:fill="E1DFDD"/>
     </w:rPr>
   </w:style>
-  <w:style w:type="paragraph" w:styleId="NormalnyWeb">
+  <w:style w:type="paragraph" w:styleId="NormalWeb">
     <w:name w:val="Normal (Web)"/>
-    <w:basedOn w:val="Normalny"/>
+    <w:basedOn w:val="Normal"/>
     <w:uiPriority w:val="99"/>
     <w:unhideWhenUsed/>
     <w:rsid w:val="00082734"/>
@@ -7371,17 +9169,17 @@
       <w:szCs w:val="24"/>
     </w:rPr>
   </w:style>
-  <w:style w:type="character" w:styleId="Odwoanieprzypisudolnego">
+  <w:style w:type="character" w:styleId="FootnoteReference">
     <w:name w:val="footnote reference"/>
-    <w:basedOn w:val="Domylnaczcionkaakapitu"/>
+    <w:basedOn w:val="DefaultParagraphFont"/>
     <w:rsid w:val="00082734"/>
     <w:rPr>
       <w:vertAlign w:val="superscript"/>
     </w:rPr>
   </w:style>
-  <w:style w:type="character" w:styleId="Pogrubienie">
+  <w:style w:type="character" w:styleId="Strong">
     <w:name w:val="Strong"/>
-    <w:basedOn w:val="Domylnaczcionkaakapitu"/>
+    <w:basedOn w:val="DefaultParagraphFont"/>
     <w:uiPriority w:val="22"/>
     <w:qFormat/>
     <w:rsid w:val="00082734"/>
@@ -7390,10 +9188,10 @@
       <w:bCs/>
     </w:rPr>
   </w:style>
-  <w:style w:type="paragraph" w:styleId="Stopka">
+  <w:style w:type="paragraph" w:styleId="Footer">
     <w:name w:val="footer"/>
-    <w:basedOn w:val="Normalny"/>
-    <w:link w:val="StopkaZnak"/>
+    <w:basedOn w:val="Normal"/>
+    <w:link w:val="FooterChar"/>
     <w:uiPriority w:val="99"/>
     <w:rsid w:val="00082734"/>
     <w:pPr>
@@ -7403,10 +9201,10 @@
       </w:tabs>
     </w:pPr>
   </w:style>
-  <w:style w:type="character" w:customStyle="1" w:styleId="StopkaZnak">
-    <w:name w:val="Stopka Znak"/>
-    <w:basedOn w:val="Domylnaczcionkaakapitu"/>
-    <w:link w:val="Stopka"/>
+  <w:style w:type="character" w:customStyle="1" w:styleId="FooterChar">
+    <w:name w:val="Footer Char"/>
+    <w:basedOn w:val="DefaultParagraphFont"/>
+    <w:link w:val="Footer"/>
     <w:uiPriority w:val="99"/>
     <w:rsid w:val="00082734"/>
     <w:rPr>
@@ -7416,23 +9214,23 @@
   </w:style>
   <w:style w:type="paragraph" w:customStyle="1" w:styleId="StylWcicienormalneWszystkiewersaliki">
     <w:name w:val="Styl Wcięcie normalne + Wszystkie wersaliki"/>
-    <w:basedOn w:val="Wcicienormalne"/>
+    <w:basedOn w:val="NormalIndent"/>
     <w:rsid w:val="00082734"/>
   </w:style>
-  <w:style w:type="paragraph" w:styleId="Tekstprzypisudolnego">
+  <w:style w:type="paragraph" w:styleId="FootnoteText">
     <w:name w:val="footnote text"/>
-    <w:basedOn w:val="Normalny"/>
-    <w:link w:val="TekstprzypisudolnegoZnak"/>
+    <w:basedOn w:val="Normal"/>
+    <w:link w:val="FootnoteTextChar"/>
     <w:rsid w:val="00082734"/>
     <w:rPr>
       <w:sz w:val="20"/>
       <w:szCs w:val="20"/>
     </w:rPr>
   </w:style>
-  <w:style w:type="character" w:customStyle="1" w:styleId="TekstprzypisudolnegoZnak">
-    <w:name w:val="Tekst przypisu dolnego Znak"/>
-    <w:basedOn w:val="Domylnaczcionkaakapitu"/>
-    <w:link w:val="Tekstprzypisudolnego"/>
+  <w:style w:type="character" w:customStyle="1" w:styleId="FootnoteTextChar">
+    <w:name w:val="Footnote Text Char"/>
+    <w:basedOn w:val="DefaultParagraphFont"/>
+    <w:link w:val="FootnoteText"/>
     <w:rsid w:val="00082734"/>
     <w:rPr>
       <w:rFonts w:asciiTheme="majorBidi" w:hAnsiTheme="majorBidi"/>
@@ -7442,7 +9240,7 @@
   </w:style>
   <w:style w:type="paragraph" w:customStyle="1" w:styleId="Teksttabeli">
     <w:name w:val="Tekst tabeli"/>
-    <w:basedOn w:val="Normalny"/>
+    <w:basedOn w:val="Normal"/>
     <w:qFormat/>
     <w:rsid w:val="00082734"/>
     <w:pPr>
@@ -7457,9 +9255,9 @@
       <w:sz w:val="16"/>
     </w:rPr>
   </w:style>
-  <w:style w:type="character" w:styleId="Tekstzastpczy">
+  <w:style w:type="character" w:styleId="PlaceholderText">
     <w:name w:val="Placeholder Text"/>
-    <w:basedOn w:val="Domylnaczcionkaakapitu"/>
+    <w:basedOn w:val="DefaultParagraphFont"/>
     <w:uiPriority w:val="99"/>
     <w:semiHidden/>
     <w:rsid w:val="00082734"/>
@@ -7467,9 +9265,9 @@
       <w:color w:val="808080"/>
     </w:rPr>
   </w:style>
-  <w:style w:type="character" w:styleId="Uwydatnienie">
+  <w:style w:type="character" w:styleId="Emphasis">
     <w:name w:val="Emphasis"/>
-    <w:basedOn w:val="Domylnaczcionkaakapitu"/>
+    <w:basedOn w:val="DefaultParagraphFont"/>
     <w:uiPriority w:val="20"/>
     <w:qFormat/>
     <w:rsid w:val="00082734"/>
@@ -7478,9 +9276,9 @@
       <w:iCs/>
     </w:rPr>
   </w:style>
-  <w:style w:type="character" w:styleId="UyteHipercze">
+  <w:style w:type="character" w:styleId="FollowedHyperlink">
     <w:name w:val="FollowedHyperlink"/>
-    <w:basedOn w:val="Domylnaczcionkaakapitu"/>
+    <w:basedOn w:val="DefaultParagraphFont"/>
     <w:uiPriority w:val="99"/>
     <w:unhideWhenUsed/>
     <w:rsid w:val="00082734"/>

</xml_diff>